<commit_message>
JK, it isn't finished.
</commit_message>
<xml_diff>
--- a/Assignment1_template_working.docx
+++ b/Assignment1_template_working.docx
@@ -23,12 +23,9 @@
     </w:p>
     <w:p>
       <w:pPr>
-        <w:pStyle w:val="Compact"/>
-        <w:numPr>
-          <w:ilvl w:val="0"/>
-          <w:numId w:val="2"/>
-        </w:numPr>
+        <w:pStyle w:val="FirstParagraph"/>
         <w:spacing w:before="0" w:after="0"/>
+        <w:contextualSpacing/>
         <w:rPr>
           <w:rFonts w:ascii="Times New Roman" w:hAnsi="Times New Roman" w:cs="Times New Roman"/>
         </w:rPr>
@@ -37,35 +34,14 @@
         <w:rPr>
           <w:rFonts w:ascii="Times New Roman" w:hAnsi="Times New Roman" w:cs="Times New Roman"/>
         </w:rPr>
-        <w:t>For the variable ‘Height’ in the ‘trees’ data set, complete the following tasks.</w:t>
+        <w:t>1. For the variable ‘Height’ in the ‘trees’ data set, complete the following tasks.</w:t>
       </w:r>
     </w:p>
     <w:p>
       <w:pPr>
-        <w:pStyle w:val="Compact"/>
+        <w:pStyle w:val="BodyText"/>
         <w:spacing w:before="0" w:after="0"/>
-        <w:rPr>
-          <w:rFonts w:ascii="Times New Roman" w:hAnsi="Times New Roman" w:cs="Times New Roman"/>
-        </w:rPr>
-      </w:pPr>
-    </w:p>
-    <w:p>
-      <w:pPr>
-        <w:pStyle w:val="Compact"/>
-        <w:spacing w:before="0" w:after="0"/>
-        <w:rPr>
-          <w:rFonts w:ascii="Times New Roman" w:hAnsi="Times New Roman" w:cs="Times New Roman"/>
-        </w:rPr>
-      </w:pPr>
-    </w:p>
-    <w:p>
-      <w:pPr>
-        <w:pStyle w:val="Compact"/>
-        <w:numPr>
-          <w:ilvl w:val="0"/>
-          <w:numId w:val="3"/>
-        </w:numPr>
-        <w:spacing w:before="0" w:after="0"/>
+        <w:contextualSpacing/>
         <w:rPr>
           <w:rFonts w:ascii="Times New Roman" w:hAnsi="Times New Roman" w:cs="Times New Roman"/>
         </w:rPr>
@@ -74,13 +50,16 @@
         <w:rPr>
           <w:rFonts w:ascii="Times New Roman" w:hAnsi="Times New Roman" w:cs="Times New Roman"/>
         </w:rPr>
-        <w:t>Calculate the mean, variance, and standard deviation. (20 pts)</w:t>
+        <w:t>A) Calculate the mean, variance, and standard deviation. (20 pts)</w:t>
       </w:r>
     </w:p>
     <w:p>
       <w:pPr>
         <w:pStyle w:val="SourceCode"/>
+        <w:shd w:val="clear" w:color="auto" w:fill="auto"/>
+        <w:wordWrap/>
         <w:spacing w:after="0"/>
+        <w:contextualSpacing/>
         <w:rPr>
           <w:rFonts w:ascii="Times New Roman" w:hAnsi="Times New Roman" w:cs="Times New Roman"/>
         </w:rPr>
@@ -91,21 +70,16 @@
           <w:rFonts w:ascii="Times New Roman" w:hAnsi="Times New Roman" w:cs="Times New Roman"/>
           <w:sz w:val="24"/>
         </w:rPr>
-        <w:t>Mean</w:t>
-      </w:r>
-      <w:r>
-        <w:rPr>
-          <w:rStyle w:val="VerbatimChar"/>
-          <w:rFonts w:ascii="Times New Roman" w:hAnsi="Times New Roman" w:cs="Times New Roman"/>
-          <w:sz w:val="24"/>
-        </w:rPr>
-        <w:t xml:space="preserve"> 76</w:t>
+        <w:t>[1] 76</w:t>
       </w:r>
     </w:p>
     <w:p>
       <w:pPr>
         <w:pStyle w:val="SourceCode"/>
+        <w:shd w:val="clear" w:color="auto" w:fill="auto"/>
+        <w:wordWrap/>
         <w:spacing w:after="0"/>
+        <w:contextualSpacing/>
         <w:rPr>
           <w:rFonts w:ascii="Times New Roman" w:hAnsi="Times New Roman" w:cs="Times New Roman"/>
         </w:rPr>
@@ -116,25 +90,18 @@
           <w:rFonts w:ascii="Times New Roman" w:hAnsi="Times New Roman" w:cs="Times New Roman"/>
           <w:sz w:val="24"/>
         </w:rPr>
-        <w:t>Variance</w:t>
-      </w:r>
-      <w:r>
-        <w:rPr>
-          <w:rStyle w:val="VerbatimChar"/>
-          <w:rFonts w:ascii="Times New Roman" w:hAnsi="Times New Roman" w:cs="Times New Roman"/>
-          <w:sz w:val="24"/>
-        </w:rPr>
-        <w:t xml:space="preserve"> 40.6</w:t>
+        <w:t>[1] 40.6</w:t>
       </w:r>
     </w:p>
     <w:p>
       <w:pPr>
         <w:pStyle w:val="SourceCode"/>
+        <w:shd w:val="clear" w:color="auto" w:fill="auto"/>
+        <w:wordWrap/>
         <w:spacing w:after="0"/>
+        <w:contextualSpacing/>
         <w:rPr>
-          <w:rStyle w:val="VerbatimChar"/>
           <w:rFonts w:ascii="Times New Roman" w:hAnsi="Times New Roman" w:cs="Times New Roman"/>
-          <w:sz w:val="24"/>
         </w:rPr>
       </w:pPr>
       <w:r>
@@ -143,43 +110,14 @@
           <w:rFonts w:ascii="Times New Roman" w:hAnsi="Times New Roman" w:cs="Times New Roman"/>
           <w:sz w:val="24"/>
         </w:rPr>
-        <w:t>Standard deviation</w:t>
-      </w:r>
-      <w:r>
-        <w:rPr>
-          <w:rStyle w:val="VerbatimChar"/>
-          <w:rFonts w:ascii="Times New Roman" w:hAnsi="Times New Roman" w:cs="Times New Roman"/>
-          <w:sz w:val="24"/>
-        </w:rPr>
-        <w:t xml:space="preserve"> 6.37</w:t>
+        <w:t>[1] 6.371813</w:t>
       </w:r>
     </w:p>
     <w:p>
       <w:pPr>
-        <w:spacing w:after="0"/>
-        <w:rPr>
-          <w:rStyle w:val="VerbatimChar"/>
-          <w:rFonts w:ascii="Times New Roman" w:hAnsi="Times New Roman" w:cs="Times New Roman"/>
-          <w:sz w:val="24"/>
-        </w:rPr>
-      </w:pPr>
-      <w:r>
-        <w:rPr>
-          <w:rStyle w:val="VerbatimChar"/>
-          <w:rFonts w:ascii="Times New Roman" w:hAnsi="Times New Roman" w:cs="Times New Roman"/>
-          <w:sz w:val="24"/>
-        </w:rPr>
-        <w:br w:type="page"/>
-      </w:r>
-    </w:p>
-    <w:p>
-      <w:pPr>
-        <w:pStyle w:val="Compact"/>
-        <w:numPr>
-          <w:ilvl w:val="0"/>
-          <w:numId w:val="4"/>
-        </w:numPr>
+        <w:pStyle w:val="FirstParagraph"/>
         <w:spacing w:before="0" w:after="0"/>
+        <w:contextualSpacing/>
         <w:rPr>
           <w:rFonts w:ascii="Times New Roman" w:hAnsi="Times New Roman" w:cs="Times New Roman"/>
         </w:rPr>
@@ -188,80 +126,13 @@
         <w:rPr>
           <w:rFonts w:ascii="Times New Roman" w:hAnsi="Times New Roman" w:cs="Times New Roman"/>
         </w:rPr>
-        <w:lastRenderedPageBreak/>
-        <w:t>Make a frequency distribution table. Make sure it includes the frequency, relative frequency, cumulative frequency and cumulative percentage. Do not exlude values which have a frequency of 0 (zero). Make sure your table is presented in APA style. Do not group the data into intervals. (60 points)</w:t>
+        <w:t>B) Make a frequency distribution table. Make sure it includes the frequency, relative frequency, cumulative frequency and cumulative percentage. Do not exlude values which have a frequency of 0 (zero). Make sure your table is presented in APA style. Do not group the data into intervals. (60 points)</w:t>
       </w:r>
-    </w:p>
-    <w:p>
-      <w:pPr>
-        <w:pStyle w:val="Compact"/>
-        <w:spacing w:before="0" w:after="0"/>
-        <w:rPr>
-          <w:rFonts w:ascii="Times New Roman" w:hAnsi="Times New Roman" w:cs="Times New Roman"/>
-        </w:rPr>
-      </w:pPr>
-    </w:p>
-    <w:p>
-      <w:pPr>
-        <w:pStyle w:val="Compact"/>
-        <w:spacing w:before="0" w:after="0"/>
-        <w:rPr>
-          <w:rFonts w:ascii="Times New Roman" w:hAnsi="Times New Roman" w:cs="Times New Roman"/>
-          <w:b/>
-          <w:bCs/>
-        </w:rPr>
-      </w:pPr>
-      <w:r>
-        <w:rPr>
-          <w:rFonts w:ascii="Times New Roman" w:hAnsi="Times New Roman" w:cs="Times New Roman"/>
-          <w:b/>
-          <w:bCs/>
-        </w:rPr>
-        <w:t>Table 1</w:t>
-      </w:r>
-    </w:p>
-    <w:p>
-      <w:pPr>
-        <w:pStyle w:val="Compact"/>
-        <w:spacing w:before="0" w:after="0"/>
-        <w:rPr>
-          <w:rFonts w:ascii="Times New Roman" w:hAnsi="Times New Roman" w:cs="Times New Roman"/>
-        </w:rPr>
-      </w:pPr>
-    </w:p>
-    <w:p>
-      <w:pPr>
-        <w:pStyle w:val="Compact"/>
-        <w:spacing w:before="0" w:after="0"/>
-        <w:rPr>
-          <w:rFonts w:ascii="Times New Roman" w:hAnsi="Times New Roman" w:cs="Times New Roman"/>
-          <w:i/>
-          <w:iCs/>
-        </w:rPr>
-      </w:pPr>
-      <w:r>
-        <w:rPr>
-          <w:rFonts w:ascii="Times New Roman" w:hAnsi="Times New Roman" w:cs="Times New Roman"/>
-          <w:i/>
-          <w:iCs/>
-        </w:rPr>
-        <w:t>Frequency Distribution Table for the Heights of Trees in the ‘trees’ Dataset</w:t>
-      </w:r>
-    </w:p>
-    <w:p>
-      <w:pPr>
-        <w:pStyle w:val="Compact"/>
-        <w:spacing w:before="0" w:after="0"/>
-        <w:rPr>
-          <w:rFonts w:ascii="Times New Roman" w:hAnsi="Times New Roman" w:cs="Times New Roman"/>
-        </w:rPr>
-      </w:pPr>
     </w:p>
     <w:tbl>
       <w:tblPr>
         <w:tblStyle w:val="Table"/>
         <w:tblW w:w="0" w:type="auto"/>
-        <w:tblInd w:w="108" w:type="dxa"/>
         <w:tblLook w:val="0020" w:firstRow="1" w:lastRow="0" w:firstColumn="0" w:lastColumn="0" w:noHBand="0" w:noVBand="0"/>
       </w:tblPr>
       <w:tblGrid>
@@ -279,16 +150,12 @@
         <w:tc>
           <w:tcPr>
             <w:tcW w:w="0" w:type="auto"/>
-            <w:tcBorders>
-              <w:top w:val="single" w:sz="4" w:space="0" w:color="auto"/>
-              <w:bottom w:val="single" w:sz="4" w:space="0" w:color="auto"/>
-            </w:tcBorders>
-          </w:tcPr>
-          <w:p>
-            <w:pPr>
-              <w:pStyle w:val="Compact"/>
-              <w:spacing w:before="0" w:after="0"/>
-              <w:jc w:val="center"/>
+          </w:tcPr>
+          <w:p>
+            <w:pPr>
+              <w:pStyle w:val="Compact"/>
+              <w:spacing w:before="0" w:after="0"/>
+              <w:contextualSpacing/>
               <w:rPr>
                 <w:rFonts w:ascii="Times New Roman" w:hAnsi="Times New Roman" w:cs="Times New Roman"/>
               </w:rPr>
@@ -304,16 +171,13 @@
         <w:tc>
           <w:tcPr>
             <w:tcW w:w="0" w:type="auto"/>
-            <w:tcBorders>
-              <w:top w:val="single" w:sz="4" w:space="0" w:color="auto"/>
-              <w:bottom w:val="single" w:sz="4" w:space="0" w:color="auto"/>
-            </w:tcBorders>
-          </w:tcPr>
-          <w:p>
-            <w:pPr>
-              <w:pStyle w:val="Compact"/>
-              <w:spacing w:before="0" w:after="0"/>
-              <w:jc w:val="center"/>
+          </w:tcPr>
+          <w:p>
+            <w:pPr>
+              <w:pStyle w:val="Compact"/>
+              <w:spacing w:before="0" w:after="0"/>
+              <w:contextualSpacing/>
+              <w:jc w:val="right"/>
               <w:rPr>
                 <w:rFonts w:ascii="Times New Roman" w:hAnsi="Times New Roman" w:cs="Times New Roman"/>
               </w:rPr>
@@ -329,16 +193,12 @@
         <w:tc>
           <w:tcPr>
             <w:tcW w:w="0" w:type="auto"/>
-            <w:tcBorders>
-              <w:top w:val="single" w:sz="4" w:space="0" w:color="auto"/>
-              <w:bottom w:val="single" w:sz="4" w:space="0" w:color="auto"/>
-            </w:tcBorders>
-          </w:tcPr>
-          <w:p>
-            <w:pPr>
-              <w:pStyle w:val="Compact"/>
-              <w:spacing w:before="0" w:after="0"/>
-              <w:jc w:val="center"/>
+          </w:tcPr>
+          <w:p>
+            <w:pPr>
+              <w:pStyle w:val="Compact"/>
+              <w:spacing w:before="0" w:after="0"/>
+              <w:contextualSpacing/>
               <w:rPr>
                 <w:rFonts w:ascii="Times New Roman" w:hAnsi="Times New Roman" w:cs="Times New Roman"/>
               </w:rPr>
@@ -354,16 +214,12 @@
         <w:tc>
           <w:tcPr>
             <w:tcW w:w="0" w:type="auto"/>
-            <w:tcBorders>
-              <w:top w:val="single" w:sz="4" w:space="0" w:color="auto"/>
-              <w:bottom w:val="single" w:sz="4" w:space="0" w:color="auto"/>
-            </w:tcBorders>
-          </w:tcPr>
-          <w:p>
-            <w:pPr>
-              <w:pStyle w:val="Compact"/>
-              <w:spacing w:before="0" w:after="0"/>
-              <w:jc w:val="center"/>
+          </w:tcPr>
+          <w:p>
+            <w:pPr>
+              <w:pStyle w:val="Compact"/>
+              <w:spacing w:before="0" w:after="0"/>
+              <w:contextualSpacing/>
               <w:rPr>
                 <w:rFonts w:ascii="Times New Roman" w:hAnsi="Times New Roman" w:cs="Times New Roman"/>
               </w:rPr>
@@ -379,16 +235,12 @@
         <w:tc>
           <w:tcPr>
             <w:tcW w:w="0" w:type="auto"/>
-            <w:tcBorders>
-              <w:top w:val="single" w:sz="4" w:space="0" w:color="auto"/>
-              <w:bottom w:val="single" w:sz="4" w:space="0" w:color="auto"/>
-            </w:tcBorders>
-          </w:tcPr>
-          <w:p>
-            <w:pPr>
-              <w:pStyle w:val="Compact"/>
-              <w:spacing w:before="0" w:after="0"/>
-              <w:jc w:val="center"/>
+          </w:tcPr>
+          <w:p>
+            <w:pPr>
+              <w:pStyle w:val="Compact"/>
+              <w:spacing w:before="0" w:after="0"/>
+              <w:contextualSpacing/>
               <w:rPr>
                 <w:rFonts w:ascii="Times New Roman" w:hAnsi="Times New Roman" w:cs="Times New Roman"/>
               </w:rPr>
@@ -406,15 +258,12 @@
         <w:tc>
           <w:tcPr>
             <w:tcW w:w="0" w:type="auto"/>
-            <w:tcBorders>
-              <w:top w:val="single" w:sz="4" w:space="0" w:color="auto"/>
-            </w:tcBorders>
-          </w:tcPr>
-          <w:p>
-            <w:pPr>
-              <w:pStyle w:val="Compact"/>
-              <w:spacing w:before="0" w:after="0"/>
-              <w:jc w:val="center"/>
+          </w:tcPr>
+          <w:p>
+            <w:pPr>
+              <w:pStyle w:val="Compact"/>
+              <w:spacing w:before="0" w:after="0"/>
+              <w:contextualSpacing/>
               <w:rPr>
                 <w:rFonts w:ascii="Times New Roman" w:hAnsi="Times New Roman" w:cs="Times New Roman"/>
               </w:rPr>
@@ -430,15 +279,13 @@
         <w:tc>
           <w:tcPr>
             <w:tcW w:w="0" w:type="auto"/>
-            <w:tcBorders>
-              <w:top w:val="single" w:sz="4" w:space="0" w:color="auto"/>
-            </w:tcBorders>
-          </w:tcPr>
-          <w:p>
-            <w:pPr>
-              <w:pStyle w:val="Compact"/>
-              <w:spacing w:before="0" w:after="0"/>
-              <w:jc w:val="center"/>
+          </w:tcPr>
+          <w:p>
+            <w:pPr>
+              <w:pStyle w:val="Compact"/>
+              <w:spacing w:before="0" w:after="0"/>
+              <w:contextualSpacing/>
+              <w:jc w:val="right"/>
               <w:rPr>
                 <w:rFonts w:ascii="Times New Roman" w:hAnsi="Times New Roman" w:cs="Times New Roman"/>
               </w:rPr>
@@ -454,15 +301,12 @@
         <w:tc>
           <w:tcPr>
             <w:tcW w:w="0" w:type="auto"/>
-            <w:tcBorders>
-              <w:top w:val="single" w:sz="4" w:space="0" w:color="auto"/>
-            </w:tcBorders>
-          </w:tcPr>
-          <w:p>
-            <w:pPr>
-              <w:pStyle w:val="Compact"/>
-              <w:spacing w:before="0" w:after="0"/>
-              <w:jc w:val="center"/>
+          </w:tcPr>
+          <w:p>
+            <w:pPr>
+              <w:pStyle w:val="Compact"/>
+              <w:spacing w:before="0" w:after="0"/>
+              <w:contextualSpacing/>
               <w:rPr>
                 <w:rFonts w:ascii="Times New Roman" w:hAnsi="Times New Roman" w:cs="Times New Roman"/>
               </w:rPr>
@@ -478,15 +322,12 @@
         <w:tc>
           <w:tcPr>
             <w:tcW w:w="0" w:type="auto"/>
-            <w:tcBorders>
-              <w:top w:val="single" w:sz="4" w:space="0" w:color="auto"/>
-            </w:tcBorders>
-          </w:tcPr>
-          <w:p>
-            <w:pPr>
-              <w:pStyle w:val="Compact"/>
-              <w:spacing w:before="0" w:after="0"/>
-              <w:jc w:val="center"/>
+          </w:tcPr>
+          <w:p>
+            <w:pPr>
+              <w:pStyle w:val="Compact"/>
+              <w:spacing w:before="0" w:after="0"/>
+              <w:contextualSpacing/>
               <w:rPr>
                 <w:rFonts w:ascii="Times New Roman" w:hAnsi="Times New Roman" w:cs="Times New Roman"/>
               </w:rPr>
@@ -502,15 +343,12 @@
         <w:tc>
           <w:tcPr>
             <w:tcW w:w="0" w:type="auto"/>
-            <w:tcBorders>
-              <w:top w:val="single" w:sz="4" w:space="0" w:color="auto"/>
-            </w:tcBorders>
-          </w:tcPr>
-          <w:p>
-            <w:pPr>
-              <w:pStyle w:val="Compact"/>
-              <w:spacing w:before="0" w:after="0"/>
-              <w:jc w:val="center"/>
+          </w:tcPr>
+          <w:p>
+            <w:pPr>
+              <w:pStyle w:val="Compact"/>
+              <w:spacing w:before="0" w:after="0"/>
+              <w:contextualSpacing/>
               <w:rPr>
                 <w:rFonts w:ascii="Times New Roman" w:hAnsi="Times New Roman" w:cs="Times New Roman"/>
               </w:rPr>
@@ -533,7 +371,7 @@
             <w:pPr>
               <w:pStyle w:val="Compact"/>
               <w:spacing w:before="0" w:after="0"/>
-              <w:jc w:val="center"/>
+              <w:contextualSpacing/>
               <w:rPr>
                 <w:rFonts w:ascii="Times New Roman" w:hAnsi="Times New Roman" w:cs="Times New Roman"/>
               </w:rPr>
@@ -554,7 +392,8 @@
             <w:pPr>
               <w:pStyle w:val="Compact"/>
               <w:spacing w:before="0" w:after="0"/>
-              <w:jc w:val="center"/>
+              <w:contextualSpacing/>
+              <w:jc w:val="right"/>
               <w:rPr>
                 <w:rFonts w:ascii="Times New Roman" w:hAnsi="Times New Roman" w:cs="Times New Roman"/>
               </w:rPr>
@@ -575,7 +414,7 @@
             <w:pPr>
               <w:pStyle w:val="Compact"/>
               <w:spacing w:before="0" w:after="0"/>
-              <w:jc w:val="center"/>
+              <w:contextualSpacing/>
               <w:rPr>
                 <w:rFonts w:ascii="Times New Roman" w:hAnsi="Times New Roman" w:cs="Times New Roman"/>
               </w:rPr>
@@ -596,7 +435,7 @@
             <w:pPr>
               <w:pStyle w:val="Compact"/>
               <w:spacing w:before="0" w:after="0"/>
-              <w:jc w:val="center"/>
+              <w:contextualSpacing/>
               <w:rPr>
                 <w:rFonts w:ascii="Times New Roman" w:hAnsi="Times New Roman" w:cs="Times New Roman"/>
               </w:rPr>
@@ -617,7 +456,7 @@
             <w:pPr>
               <w:pStyle w:val="Compact"/>
               <w:spacing w:before="0" w:after="0"/>
-              <w:jc w:val="center"/>
+              <w:contextualSpacing/>
               <w:rPr>
                 <w:rFonts w:ascii="Times New Roman" w:hAnsi="Times New Roman" w:cs="Times New Roman"/>
               </w:rPr>
@@ -640,7 +479,7 @@
             <w:pPr>
               <w:pStyle w:val="Compact"/>
               <w:spacing w:before="0" w:after="0"/>
-              <w:jc w:val="center"/>
+              <w:contextualSpacing/>
               <w:rPr>
                 <w:rFonts w:ascii="Times New Roman" w:hAnsi="Times New Roman" w:cs="Times New Roman"/>
               </w:rPr>
@@ -661,7 +500,8 @@
             <w:pPr>
               <w:pStyle w:val="Compact"/>
               <w:spacing w:before="0" w:after="0"/>
-              <w:jc w:val="center"/>
+              <w:contextualSpacing/>
+              <w:jc w:val="right"/>
               <w:rPr>
                 <w:rFonts w:ascii="Times New Roman" w:hAnsi="Times New Roman" w:cs="Times New Roman"/>
               </w:rPr>
@@ -682,7 +522,7 @@
             <w:pPr>
               <w:pStyle w:val="Compact"/>
               <w:spacing w:before="0" w:after="0"/>
-              <w:jc w:val="center"/>
+              <w:contextualSpacing/>
               <w:rPr>
                 <w:rFonts w:ascii="Times New Roman" w:hAnsi="Times New Roman" w:cs="Times New Roman"/>
               </w:rPr>
@@ -703,7 +543,7 @@
             <w:pPr>
               <w:pStyle w:val="Compact"/>
               <w:spacing w:before="0" w:after="0"/>
-              <w:jc w:val="center"/>
+              <w:contextualSpacing/>
               <w:rPr>
                 <w:rFonts w:ascii="Times New Roman" w:hAnsi="Times New Roman" w:cs="Times New Roman"/>
               </w:rPr>
@@ -724,7 +564,7 @@
             <w:pPr>
               <w:pStyle w:val="Compact"/>
               <w:spacing w:before="0" w:after="0"/>
-              <w:jc w:val="center"/>
+              <w:contextualSpacing/>
               <w:rPr>
                 <w:rFonts w:ascii="Times New Roman" w:hAnsi="Times New Roman" w:cs="Times New Roman"/>
               </w:rPr>
@@ -747,7 +587,7 @@
             <w:pPr>
               <w:pStyle w:val="Compact"/>
               <w:spacing w:before="0" w:after="0"/>
-              <w:jc w:val="center"/>
+              <w:contextualSpacing/>
               <w:rPr>
                 <w:rFonts w:ascii="Times New Roman" w:hAnsi="Times New Roman" w:cs="Times New Roman"/>
               </w:rPr>
@@ -768,7 +608,8 @@
             <w:pPr>
               <w:pStyle w:val="Compact"/>
               <w:spacing w:before="0" w:after="0"/>
-              <w:jc w:val="center"/>
+              <w:contextualSpacing/>
+              <w:jc w:val="right"/>
               <w:rPr>
                 <w:rFonts w:ascii="Times New Roman" w:hAnsi="Times New Roman" w:cs="Times New Roman"/>
               </w:rPr>
@@ -789,7 +630,7 @@
             <w:pPr>
               <w:pStyle w:val="Compact"/>
               <w:spacing w:before="0" w:after="0"/>
-              <w:jc w:val="center"/>
+              <w:contextualSpacing/>
               <w:rPr>
                 <w:rFonts w:ascii="Times New Roman" w:hAnsi="Times New Roman" w:cs="Times New Roman"/>
               </w:rPr>
@@ -810,7 +651,7 @@
             <w:pPr>
               <w:pStyle w:val="Compact"/>
               <w:spacing w:before="0" w:after="0"/>
-              <w:jc w:val="center"/>
+              <w:contextualSpacing/>
               <w:rPr>
                 <w:rFonts w:ascii="Times New Roman" w:hAnsi="Times New Roman" w:cs="Times New Roman"/>
               </w:rPr>
@@ -831,7 +672,7 @@
             <w:pPr>
               <w:pStyle w:val="Compact"/>
               <w:spacing w:before="0" w:after="0"/>
-              <w:jc w:val="center"/>
+              <w:contextualSpacing/>
               <w:rPr>
                 <w:rFonts w:ascii="Times New Roman" w:hAnsi="Times New Roman" w:cs="Times New Roman"/>
               </w:rPr>
@@ -854,7 +695,7 @@
             <w:pPr>
               <w:pStyle w:val="Compact"/>
               <w:spacing w:before="0" w:after="0"/>
-              <w:jc w:val="center"/>
+              <w:contextualSpacing/>
               <w:rPr>
                 <w:rFonts w:ascii="Times New Roman" w:hAnsi="Times New Roman" w:cs="Times New Roman"/>
               </w:rPr>
@@ -875,7 +716,8 @@
             <w:pPr>
               <w:pStyle w:val="Compact"/>
               <w:spacing w:before="0" w:after="0"/>
-              <w:jc w:val="center"/>
+              <w:contextualSpacing/>
+              <w:jc w:val="right"/>
               <w:rPr>
                 <w:rFonts w:ascii="Times New Roman" w:hAnsi="Times New Roman" w:cs="Times New Roman"/>
               </w:rPr>
@@ -896,7 +738,7 @@
             <w:pPr>
               <w:pStyle w:val="Compact"/>
               <w:spacing w:before="0" w:after="0"/>
-              <w:jc w:val="center"/>
+              <w:contextualSpacing/>
               <w:rPr>
                 <w:rFonts w:ascii="Times New Roman" w:hAnsi="Times New Roman" w:cs="Times New Roman"/>
               </w:rPr>
@@ -917,7 +759,7 @@
             <w:pPr>
               <w:pStyle w:val="Compact"/>
               <w:spacing w:before="0" w:after="0"/>
-              <w:jc w:val="center"/>
+              <w:contextualSpacing/>
               <w:rPr>
                 <w:rFonts w:ascii="Times New Roman" w:hAnsi="Times New Roman" w:cs="Times New Roman"/>
               </w:rPr>
@@ -938,7 +780,7 @@
             <w:pPr>
               <w:pStyle w:val="Compact"/>
               <w:spacing w:before="0" w:after="0"/>
-              <w:jc w:val="center"/>
+              <w:contextualSpacing/>
               <w:rPr>
                 <w:rFonts w:ascii="Times New Roman" w:hAnsi="Times New Roman" w:cs="Times New Roman"/>
               </w:rPr>
@@ -961,7 +803,7 @@
             <w:pPr>
               <w:pStyle w:val="Compact"/>
               <w:spacing w:before="0" w:after="0"/>
-              <w:jc w:val="center"/>
+              <w:contextualSpacing/>
               <w:rPr>
                 <w:rFonts w:ascii="Times New Roman" w:hAnsi="Times New Roman" w:cs="Times New Roman"/>
               </w:rPr>
@@ -982,7 +824,8 @@
             <w:pPr>
               <w:pStyle w:val="Compact"/>
               <w:spacing w:before="0" w:after="0"/>
-              <w:jc w:val="center"/>
+              <w:contextualSpacing/>
+              <w:jc w:val="right"/>
               <w:rPr>
                 <w:rFonts w:ascii="Times New Roman" w:hAnsi="Times New Roman" w:cs="Times New Roman"/>
               </w:rPr>
@@ -1003,7 +846,7 @@
             <w:pPr>
               <w:pStyle w:val="Compact"/>
               <w:spacing w:before="0" w:after="0"/>
-              <w:jc w:val="center"/>
+              <w:contextualSpacing/>
               <w:rPr>
                 <w:rFonts w:ascii="Times New Roman" w:hAnsi="Times New Roman" w:cs="Times New Roman"/>
               </w:rPr>
@@ -1024,7 +867,7 @@
             <w:pPr>
               <w:pStyle w:val="Compact"/>
               <w:spacing w:before="0" w:after="0"/>
-              <w:jc w:val="center"/>
+              <w:contextualSpacing/>
               <w:rPr>
                 <w:rFonts w:ascii="Times New Roman" w:hAnsi="Times New Roman" w:cs="Times New Roman"/>
               </w:rPr>
@@ -1045,7 +888,7 @@
             <w:pPr>
               <w:pStyle w:val="Compact"/>
               <w:spacing w:before="0" w:after="0"/>
-              <w:jc w:val="center"/>
+              <w:contextualSpacing/>
               <w:rPr>
                 <w:rFonts w:ascii="Times New Roman" w:hAnsi="Times New Roman" w:cs="Times New Roman"/>
               </w:rPr>
@@ -1068,7 +911,7 @@
             <w:pPr>
               <w:pStyle w:val="Compact"/>
               <w:spacing w:before="0" w:after="0"/>
-              <w:jc w:val="center"/>
+              <w:contextualSpacing/>
               <w:rPr>
                 <w:rFonts w:ascii="Times New Roman" w:hAnsi="Times New Roman" w:cs="Times New Roman"/>
               </w:rPr>
@@ -1089,7 +932,8 @@
             <w:pPr>
               <w:pStyle w:val="Compact"/>
               <w:spacing w:before="0" w:after="0"/>
-              <w:jc w:val="center"/>
+              <w:contextualSpacing/>
+              <w:jc w:val="right"/>
               <w:rPr>
                 <w:rFonts w:ascii="Times New Roman" w:hAnsi="Times New Roman" w:cs="Times New Roman"/>
               </w:rPr>
@@ -1110,7 +954,7 @@
             <w:pPr>
               <w:pStyle w:val="Compact"/>
               <w:spacing w:before="0" w:after="0"/>
-              <w:jc w:val="center"/>
+              <w:contextualSpacing/>
               <w:rPr>
                 <w:rFonts w:ascii="Times New Roman" w:hAnsi="Times New Roman" w:cs="Times New Roman"/>
               </w:rPr>
@@ -1131,7 +975,7 @@
             <w:pPr>
               <w:pStyle w:val="Compact"/>
               <w:spacing w:before="0" w:after="0"/>
-              <w:jc w:val="center"/>
+              <w:contextualSpacing/>
               <w:rPr>
                 <w:rFonts w:ascii="Times New Roman" w:hAnsi="Times New Roman" w:cs="Times New Roman"/>
               </w:rPr>
@@ -1152,7 +996,7 @@
             <w:pPr>
               <w:pStyle w:val="Compact"/>
               <w:spacing w:before="0" w:after="0"/>
-              <w:jc w:val="center"/>
+              <w:contextualSpacing/>
               <w:rPr>
                 <w:rFonts w:ascii="Times New Roman" w:hAnsi="Times New Roman" w:cs="Times New Roman"/>
               </w:rPr>
@@ -1175,7 +1019,7 @@
             <w:pPr>
               <w:pStyle w:val="Compact"/>
               <w:spacing w:before="0" w:after="0"/>
-              <w:jc w:val="center"/>
+              <w:contextualSpacing/>
               <w:rPr>
                 <w:rFonts w:ascii="Times New Roman" w:hAnsi="Times New Roman" w:cs="Times New Roman"/>
               </w:rPr>
@@ -1196,7 +1040,8 @@
             <w:pPr>
               <w:pStyle w:val="Compact"/>
               <w:spacing w:before="0" w:after="0"/>
-              <w:jc w:val="center"/>
+              <w:contextualSpacing/>
+              <w:jc w:val="right"/>
               <w:rPr>
                 <w:rFonts w:ascii="Times New Roman" w:hAnsi="Times New Roman" w:cs="Times New Roman"/>
               </w:rPr>
@@ -1217,7 +1062,7 @@
             <w:pPr>
               <w:pStyle w:val="Compact"/>
               <w:spacing w:before="0" w:after="0"/>
-              <w:jc w:val="center"/>
+              <w:contextualSpacing/>
               <w:rPr>
                 <w:rFonts w:ascii="Times New Roman" w:hAnsi="Times New Roman" w:cs="Times New Roman"/>
               </w:rPr>
@@ -1238,7 +1083,7 @@
             <w:pPr>
               <w:pStyle w:val="Compact"/>
               <w:spacing w:before="0" w:after="0"/>
-              <w:jc w:val="center"/>
+              <w:contextualSpacing/>
               <w:rPr>
                 <w:rFonts w:ascii="Times New Roman" w:hAnsi="Times New Roman" w:cs="Times New Roman"/>
               </w:rPr>
@@ -1259,7 +1104,7 @@
             <w:pPr>
               <w:pStyle w:val="Compact"/>
               <w:spacing w:before="0" w:after="0"/>
-              <w:jc w:val="center"/>
+              <w:contextualSpacing/>
               <w:rPr>
                 <w:rFonts w:ascii="Times New Roman" w:hAnsi="Times New Roman" w:cs="Times New Roman"/>
               </w:rPr>
@@ -1282,7 +1127,7 @@
             <w:pPr>
               <w:pStyle w:val="Compact"/>
               <w:spacing w:before="0" w:after="0"/>
-              <w:jc w:val="center"/>
+              <w:contextualSpacing/>
               <w:rPr>
                 <w:rFonts w:ascii="Times New Roman" w:hAnsi="Times New Roman" w:cs="Times New Roman"/>
               </w:rPr>
@@ -1303,7 +1148,8 @@
             <w:pPr>
               <w:pStyle w:val="Compact"/>
               <w:spacing w:before="0" w:after="0"/>
-              <w:jc w:val="center"/>
+              <w:contextualSpacing/>
+              <w:jc w:val="right"/>
               <w:rPr>
                 <w:rFonts w:ascii="Times New Roman" w:hAnsi="Times New Roman" w:cs="Times New Roman"/>
               </w:rPr>
@@ -1324,7 +1170,7 @@
             <w:pPr>
               <w:pStyle w:val="Compact"/>
               <w:spacing w:before="0" w:after="0"/>
-              <w:jc w:val="center"/>
+              <w:contextualSpacing/>
               <w:rPr>
                 <w:rFonts w:ascii="Times New Roman" w:hAnsi="Times New Roman" w:cs="Times New Roman"/>
               </w:rPr>
@@ -1345,7 +1191,7 @@
             <w:pPr>
               <w:pStyle w:val="Compact"/>
               <w:spacing w:before="0" w:after="0"/>
-              <w:jc w:val="center"/>
+              <w:contextualSpacing/>
               <w:rPr>
                 <w:rFonts w:ascii="Times New Roman" w:hAnsi="Times New Roman" w:cs="Times New Roman"/>
               </w:rPr>
@@ -1366,7 +1212,7 @@
             <w:pPr>
               <w:pStyle w:val="Compact"/>
               <w:spacing w:before="0" w:after="0"/>
-              <w:jc w:val="center"/>
+              <w:contextualSpacing/>
               <w:rPr>
                 <w:rFonts w:ascii="Times New Roman" w:hAnsi="Times New Roman" w:cs="Times New Roman"/>
               </w:rPr>
@@ -1389,7 +1235,7 @@
             <w:pPr>
               <w:pStyle w:val="Compact"/>
               <w:spacing w:before="0" w:after="0"/>
-              <w:jc w:val="center"/>
+              <w:contextualSpacing/>
               <w:rPr>
                 <w:rFonts w:ascii="Times New Roman" w:hAnsi="Times New Roman" w:cs="Times New Roman"/>
               </w:rPr>
@@ -1410,7 +1256,8 @@
             <w:pPr>
               <w:pStyle w:val="Compact"/>
               <w:spacing w:before="0" w:after="0"/>
-              <w:jc w:val="center"/>
+              <w:contextualSpacing/>
+              <w:jc w:val="right"/>
               <w:rPr>
                 <w:rFonts w:ascii="Times New Roman" w:hAnsi="Times New Roman" w:cs="Times New Roman"/>
               </w:rPr>
@@ -1431,7 +1278,7 @@
             <w:pPr>
               <w:pStyle w:val="Compact"/>
               <w:spacing w:before="0" w:after="0"/>
-              <w:jc w:val="center"/>
+              <w:contextualSpacing/>
               <w:rPr>
                 <w:rFonts w:ascii="Times New Roman" w:hAnsi="Times New Roman" w:cs="Times New Roman"/>
               </w:rPr>
@@ -1452,7 +1299,7 @@
             <w:pPr>
               <w:pStyle w:val="Compact"/>
               <w:spacing w:before="0" w:after="0"/>
-              <w:jc w:val="center"/>
+              <w:contextualSpacing/>
               <w:rPr>
                 <w:rFonts w:ascii="Times New Roman" w:hAnsi="Times New Roman" w:cs="Times New Roman"/>
               </w:rPr>
@@ -1473,7 +1320,7 @@
             <w:pPr>
               <w:pStyle w:val="Compact"/>
               <w:spacing w:before="0" w:after="0"/>
-              <w:jc w:val="center"/>
+              <w:contextualSpacing/>
               <w:rPr>
                 <w:rFonts w:ascii="Times New Roman" w:hAnsi="Times New Roman" w:cs="Times New Roman"/>
               </w:rPr>
@@ -1496,7 +1343,7 @@
             <w:pPr>
               <w:pStyle w:val="Compact"/>
               <w:spacing w:before="0" w:after="0"/>
-              <w:jc w:val="center"/>
+              <w:contextualSpacing/>
               <w:rPr>
                 <w:rFonts w:ascii="Times New Roman" w:hAnsi="Times New Roman" w:cs="Times New Roman"/>
               </w:rPr>
@@ -1517,7 +1364,8 @@
             <w:pPr>
               <w:pStyle w:val="Compact"/>
               <w:spacing w:before="0" w:after="0"/>
-              <w:jc w:val="center"/>
+              <w:contextualSpacing/>
+              <w:jc w:val="right"/>
               <w:rPr>
                 <w:rFonts w:ascii="Times New Roman" w:hAnsi="Times New Roman" w:cs="Times New Roman"/>
               </w:rPr>
@@ -1538,7 +1386,7 @@
             <w:pPr>
               <w:pStyle w:val="Compact"/>
               <w:spacing w:before="0" w:after="0"/>
-              <w:jc w:val="center"/>
+              <w:contextualSpacing/>
               <w:rPr>
                 <w:rFonts w:ascii="Times New Roman" w:hAnsi="Times New Roman" w:cs="Times New Roman"/>
               </w:rPr>
@@ -1559,7 +1407,7 @@
             <w:pPr>
               <w:pStyle w:val="Compact"/>
               <w:spacing w:before="0" w:after="0"/>
-              <w:jc w:val="center"/>
+              <w:contextualSpacing/>
               <w:rPr>
                 <w:rFonts w:ascii="Times New Roman" w:hAnsi="Times New Roman" w:cs="Times New Roman"/>
               </w:rPr>
@@ -1580,7 +1428,7 @@
             <w:pPr>
               <w:pStyle w:val="Compact"/>
               <w:spacing w:before="0" w:after="0"/>
-              <w:jc w:val="center"/>
+              <w:contextualSpacing/>
               <w:rPr>
                 <w:rFonts w:ascii="Times New Roman" w:hAnsi="Times New Roman" w:cs="Times New Roman"/>
               </w:rPr>
@@ -1603,7 +1451,7 @@
             <w:pPr>
               <w:pStyle w:val="Compact"/>
               <w:spacing w:before="0" w:after="0"/>
-              <w:jc w:val="center"/>
+              <w:contextualSpacing/>
               <w:rPr>
                 <w:rFonts w:ascii="Times New Roman" w:hAnsi="Times New Roman" w:cs="Times New Roman"/>
               </w:rPr>
@@ -1624,7 +1472,8 @@
             <w:pPr>
               <w:pStyle w:val="Compact"/>
               <w:spacing w:before="0" w:after="0"/>
-              <w:jc w:val="center"/>
+              <w:contextualSpacing/>
+              <w:jc w:val="right"/>
               <w:rPr>
                 <w:rFonts w:ascii="Times New Roman" w:hAnsi="Times New Roman" w:cs="Times New Roman"/>
               </w:rPr>
@@ -1645,7 +1494,7 @@
             <w:pPr>
               <w:pStyle w:val="Compact"/>
               <w:spacing w:before="0" w:after="0"/>
-              <w:jc w:val="center"/>
+              <w:contextualSpacing/>
               <w:rPr>
                 <w:rFonts w:ascii="Times New Roman" w:hAnsi="Times New Roman" w:cs="Times New Roman"/>
               </w:rPr>
@@ -1666,7 +1515,7 @@
             <w:pPr>
               <w:pStyle w:val="Compact"/>
               <w:spacing w:before="0" w:after="0"/>
-              <w:jc w:val="center"/>
+              <w:contextualSpacing/>
               <w:rPr>
                 <w:rFonts w:ascii="Times New Roman" w:hAnsi="Times New Roman" w:cs="Times New Roman"/>
               </w:rPr>
@@ -1687,7 +1536,7 @@
             <w:pPr>
               <w:pStyle w:val="Compact"/>
               <w:spacing w:before="0" w:after="0"/>
-              <w:jc w:val="center"/>
+              <w:contextualSpacing/>
               <w:rPr>
                 <w:rFonts w:ascii="Times New Roman" w:hAnsi="Times New Roman" w:cs="Times New Roman"/>
               </w:rPr>
@@ -1710,7 +1559,7 @@
             <w:pPr>
               <w:pStyle w:val="Compact"/>
               <w:spacing w:before="0" w:after="0"/>
-              <w:jc w:val="center"/>
+              <w:contextualSpacing/>
               <w:rPr>
                 <w:rFonts w:ascii="Times New Roman" w:hAnsi="Times New Roman" w:cs="Times New Roman"/>
               </w:rPr>
@@ -1731,7 +1580,8 @@
             <w:pPr>
               <w:pStyle w:val="Compact"/>
               <w:spacing w:before="0" w:after="0"/>
-              <w:jc w:val="center"/>
+              <w:contextualSpacing/>
+              <w:jc w:val="right"/>
               <w:rPr>
                 <w:rFonts w:ascii="Times New Roman" w:hAnsi="Times New Roman" w:cs="Times New Roman"/>
               </w:rPr>
@@ -1752,7 +1602,7 @@
             <w:pPr>
               <w:pStyle w:val="Compact"/>
               <w:spacing w:before="0" w:after="0"/>
-              <w:jc w:val="center"/>
+              <w:contextualSpacing/>
               <w:rPr>
                 <w:rFonts w:ascii="Times New Roman" w:hAnsi="Times New Roman" w:cs="Times New Roman"/>
               </w:rPr>
@@ -1773,7 +1623,7 @@
             <w:pPr>
               <w:pStyle w:val="Compact"/>
               <w:spacing w:before="0" w:after="0"/>
-              <w:jc w:val="center"/>
+              <w:contextualSpacing/>
               <w:rPr>
                 <w:rFonts w:ascii="Times New Roman" w:hAnsi="Times New Roman" w:cs="Times New Roman"/>
               </w:rPr>
@@ -1794,7 +1644,7 @@
             <w:pPr>
               <w:pStyle w:val="Compact"/>
               <w:spacing w:before="0" w:after="0"/>
-              <w:jc w:val="center"/>
+              <w:contextualSpacing/>
               <w:rPr>
                 <w:rFonts w:ascii="Times New Roman" w:hAnsi="Times New Roman" w:cs="Times New Roman"/>
               </w:rPr>
@@ -1817,7 +1667,7 @@
             <w:pPr>
               <w:pStyle w:val="Compact"/>
               <w:spacing w:before="0" w:after="0"/>
-              <w:jc w:val="center"/>
+              <w:contextualSpacing/>
               <w:rPr>
                 <w:rFonts w:ascii="Times New Roman" w:hAnsi="Times New Roman" w:cs="Times New Roman"/>
               </w:rPr>
@@ -1838,7 +1688,8 @@
             <w:pPr>
               <w:pStyle w:val="Compact"/>
               <w:spacing w:before="0" w:after="0"/>
-              <w:jc w:val="center"/>
+              <w:contextualSpacing/>
+              <w:jc w:val="right"/>
               <w:rPr>
                 <w:rFonts w:ascii="Times New Roman" w:hAnsi="Times New Roman" w:cs="Times New Roman"/>
               </w:rPr>
@@ -1859,7 +1710,7 @@
             <w:pPr>
               <w:pStyle w:val="Compact"/>
               <w:spacing w:before="0" w:after="0"/>
-              <w:jc w:val="center"/>
+              <w:contextualSpacing/>
               <w:rPr>
                 <w:rFonts w:ascii="Times New Roman" w:hAnsi="Times New Roman" w:cs="Times New Roman"/>
               </w:rPr>
@@ -1880,7 +1731,7 @@
             <w:pPr>
               <w:pStyle w:val="Compact"/>
               <w:spacing w:before="0" w:after="0"/>
-              <w:jc w:val="center"/>
+              <w:contextualSpacing/>
               <w:rPr>
                 <w:rFonts w:ascii="Times New Roman" w:hAnsi="Times New Roman" w:cs="Times New Roman"/>
               </w:rPr>
@@ -1901,7 +1752,7 @@
             <w:pPr>
               <w:pStyle w:val="Compact"/>
               <w:spacing w:before="0" w:after="0"/>
-              <w:jc w:val="center"/>
+              <w:contextualSpacing/>
               <w:rPr>
                 <w:rFonts w:ascii="Times New Roman" w:hAnsi="Times New Roman" w:cs="Times New Roman"/>
               </w:rPr>
@@ -1924,7 +1775,7 @@
             <w:pPr>
               <w:pStyle w:val="Compact"/>
               <w:spacing w:before="0" w:after="0"/>
-              <w:jc w:val="center"/>
+              <w:contextualSpacing/>
               <w:rPr>
                 <w:rFonts w:ascii="Times New Roman" w:hAnsi="Times New Roman" w:cs="Times New Roman"/>
               </w:rPr>
@@ -1945,7 +1796,8 @@
             <w:pPr>
               <w:pStyle w:val="Compact"/>
               <w:spacing w:before="0" w:after="0"/>
-              <w:jc w:val="center"/>
+              <w:contextualSpacing/>
+              <w:jc w:val="right"/>
               <w:rPr>
                 <w:rFonts w:ascii="Times New Roman" w:hAnsi="Times New Roman" w:cs="Times New Roman"/>
               </w:rPr>
@@ -1966,7 +1818,7 @@
             <w:pPr>
               <w:pStyle w:val="Compact"/>
               <w:spacing w:before="0" w:after="0"/>
-              <w:jc w:val="center"/>
+              <w:contextualSpacing/>
               <w:rPr>
                 <w:rFonts w:ascii="Times New Roman" w:hAnsi="Times New Roman" w:cs="Times New Roman"/>
               </w:rPr>
@@ -1987,7 +1839,7 @@
             <w:pPr>
               <w:pStyle w:val="Compact"/>
               <w:spacing w:before="0" w:after="0"/>
-              <w:jc w:val="center"/>
+              <w:contextualSpacing/>
               <w:rPr>
                 <w:rFonts w:ascii="Times New Roman" w:hAnsi="Times New Roman" w:cs="Times New Roman"/>
               </w:rPr>
@@ -2008,7 +1860,7 @@
             <w:pPr>
               <w:pStyle w:val="Compact"/>
               <w:spacing w:before="0" w:after="0"/>
-              <w:jc w:val="center"/>
+              <w:contextualSpacing/>
               <w:rPr>
                 <w:rFonts w:ascii="Times New Roman" w:hAnsi="Times New Roman" w:cs="Times New Roman"/>
               </w:rPr>
@@ -2031,7 +1883,7 @@
             <w:pPr>
               <w:pStyle w:val="Compact"/>
               <w:spacing w:before="0" w:after="0"/>
-              <w:jc w:val="center"/>
+              <w:contextualSpacing/>
               <w:rPr>
                 <w:rFonts w:ascii="Times New Roman" w:hAnsi="Times New Roman" w:cs="Times New Roman"/>
               </w:rPr>
@@ -2052,7 +1904,8 @@
             <w:pPr>
               <w:pStyle w:val="Compact"/>
               <w:spacing w:before="0" w:after="0"/>
-              <w:jc w:val="center"/>
+              <w:contextualSpacing/>
+              <w:jc w:val="right"/>
               <w:rPr>
                 <w:rFonts w:ascii="Times New Roman" w:hAnsi="Times New Roman" w:cs="Times New Roman"/>
               </w:rPr>
@@ -2073,7 +1926,7 @@
             <w:pPr>
               <w:pStyle w:val="Compact"/>
               <w:spacing w:before="0" w:after="0"/>
-              <w:jc w:val="center"/>
+              <w:contextualSpacing/>
               <w:rPr>
                 <w:rFonts w:ascii="Times New Roman" w:hAnsi="Times New Roman" w:cs="Times New Roman"/>
               </w:rPr>
@@ -2094,7 +1947,7 @@
             <w:pPr>
               <w:pStyle w:val="Compact"/>
               <w:spacing w:before="0" w:after="0"/>
-              <w:jc w:val="center"/>
+              <w:contextualSpacing/>
               <w:rPr>
                 <w:rFonts w:ascii="Times New Roman" w:hAnsi="Times New Roman" w:cs="Times New Roman"/>
               </w:rPr>
@@ -2115,7 +1968,7 @@
             <w:pPr>
               <w:pStyle w:val="Compact"/>
               <w:spacing w:before="0" w:after="0"/>
-              <w:jc w:val="center"/>
+              <w:contextualSpacing/>
               <w:rPr>
                 <w:rFonts w:ascii="Times New Roman" w:hAnsi="Times New Roman" w:cs="Times New Roman"/>
               </w:rPr>
@@ -2138,7 +1991,7 @@
             <w:pPr>
               <w:pStyle w:val="Compact"/>
               <w:spacing w:before="0" w:after="0"/>
-              <w:jc w:val="center"/>
+              <w:contextualSpacing/>
               <w:rPr>
                 <w:rFonts w:ascii="Times New Roman" w:hAnsi="Times New Roman" w:cs="Times New Roman"/>
               </w:rPr>
@@ -2159,7 +2012,8 @@
             <w:pPr>
               <w:pStyle w:val="Compact"/>
               <w:spacing w:before="0" w:after="0"/>
-              <w:jc w:val="center"/>
+              <w:contextualSpacing/>
+              <w:jc w:val="right"/>
               <w:rPr>
                 <w:rFonts w:ascii="Times New Roman" w:hAnsi="Times New Roman" w:cs="Times New Roman"/>
               </w:rPr>
@@ -2180,7 +2034,7 @@
             <w:pPr>
               <w:pStyle w:val="Compact"/>
               <w:spacing w:before="0" w:after="0"/>
-              <w:jc w:val="center"/>
+              <w:contextualSpacing/>
               <w:rPr>
                 <w:rFonts w:ascii="Times New Roman" w:hAnsi="Times New Roman" w:cs="Times New Roman"/>
               </w:rPr>
@@ -2201,7 +2055,7 @@
             <w:pPr>
               <w:pStyle w:val="Compact"/>
               <w:spacing w:before="0" w:after="0"/>
-              <w:jc w:val="center"/>
+              <w:contextualSpacing/>
               <w:rPr>
                 <w:rFonts w:ascii="Times New Roman" w:hAnsi="Times New Roman" w:cs="Times New Roman"/>
               </w:rPr>
@@ -2222,7 +2076,7 @@
             <w:pPr>
               <w:pStyle w:val="Compact"/>
               <w:spacing w:before="0" w:after="0"/>
-              <w:jc w:val="center"/>
+              <w:contextualSpacing/>
               <w:rPr>
                 <w:rFonts w:ascii="Times New Roman" w:hAnsi="Times New Roman" w:cs="Times New Roman"/>
               </w:rPr>
@@ -2245,7 +2099,7 @@
             <w:pPr>
               <w:pStyle w:val="Compact"/>
               <w:spacing w:before="0" w:after="0"/>
-              <w:jc w:val="center"/>
+              <w:contextualSpacing/>
               <w:rPr>
                 <w:rFonts w:ascii="Times New Roman" w:hAnsi="Times New Roman" w:cs="Times New Roman"/>
               </w:rPr>
@@ -2266,7 +2120,8 @@
             <w:pPr>
               <w:pStyle w:val="Compact"/>
               <w:spacing w:before="0" w:after="0"/>
-              <w:jc w:val="center"/>
+              <w:contextualSpacing/>
+              <w:jc w:val="right"/>
               <w:rPr>
                 <w:rFonts w:ascii="Times New Roman" w:hAnsi="Times New Roman" w:cs="Times New Roman"/>
               </w:rPr>
@@ -2287,7 +2142,7 @@
             <w:pPr>
               <w:pStyle w:val="Compact"/>
               <w:spacing w:before="0" w:after="0"/>
-              <w:jc w:val="center"/>
+              <w:contextualSpacing/>
               <w:rPr>
                 <w:rFonts w:ascii="Times New Roman" w:hAnsi="Times New Roman" w:cs="Times New Roman"/>
               </w:rPr>
@@ -2308,7 +2163,7 @@
             <w:pPr>
               <w:pStyle w:val="Compact"/>
               <w:spacing w:before="0" w:after="0"/>
-              <w:jc w:val="center"/>
+              <w:contextualSpacing/>
               <w:rPr>
                 <w:rFonts w:ascii="Times New Roman" w:hAnsi="Times New Roman" w:cs="Times New Roman"/>
               </w:rPr>
@@ -2329,7 +2184,7 @@
             <w:pPr>
               <w:pStyle w:val="Compact"/>
               <w:spacing w:before="0" w:after="0"/>
-              <w:jc w:val="center"/>
+              <w:contextualSpacing/>
               <w:rPr>
                 <w:rFonts w:ascii="Times New Roman" w:hAnsi="Times New Roman" w:cs="Times New Roman"/>
               </w:rPr>
@@ -2352,7 +2207,7 @@
             <w:pPr>
               <w:pStyle w:val="Compact"/>
               <w:spacing w:before="0" w:after="0"/>
-              <w:jc w:val="center"/>
+              <w:contextualSpacing/>
               <w:rPr>
                 <w:rFonts w:ascii="Times New Roman" w:hAnsi="Times New Roman" w:cs="Times New Roman"/>
               </w:rPr>
@@ -2373,7 +2228,8 @@
             <w:pPr>
               <w:pStyle w:val="Compact"/>
               <w:spacing w:before="0" w:after="0"/>
-              <w:jc w:val="center"/>
+              <w:contextualSpacing/>
+              <w:jc w:val="right"/>
               <w:rPr>
                 <w:rFonts w:ascii="Times New Roman" w:hAnsi="Times New Roman" w:cs="Times New Roman"/>
               </w:rPr>
@@ -2394,7 +2250,7 @@
             <w:pPr>
               <w:pStyle w:val="Compact"/>
               <w:spacing w:before="0" w:after="0"/>
-              <w:jc w:val="center"/>
+              <w:contextualSpacing/>
               <w:rPr>
                 <w:rFonts w:ascii="Times New Roman" w:hAnsi="Times New Roman" w:cs="Times New Roman"/>
               </w:rPr>
@@ -2415,7 +2271,7 @@
             <w:pPr>
               <w:pStyle w:val="Compact"/>
               <w:spacing w:before="0" w:after="0"/>
-              <w:jc w:val="center"/>
+              <w:contextualSpacing/>
               <w:rPr>
                 <w:rFonts w:ascii="Times New Roman" w:hAnsi="Times New Roman" w:cs="Times New Roman"/>
               </w:rPr>
@@ -2436,7 +2292,7 @@
             <w:pPr>
               <w:pStyle w:val="Compact"/>
               <w:spacing w:before="0" w:after="0"/>
-              <w:jc w:val="center"/>
+              <w:contextualSpacing/>
               <w:rPr>
                 <w:rFonts w:ascii="Times New Roman" w:hAnsi="Times New Roman" w:cs="Times New Roman"/>
               </w:rPr>
@@ -2459,7 +2315,7 @@
             <w:pPr>
               <w:pStyle w:val="Compact"/>
               <w:spacing w:before="0" w:after="0"/>
-              <w:jc w:val="center"/>
+              <w:contextualSpacing/>
               <w:rPr>
                 <w:rFonts w:ascii="Times New Roman" w:hAnsi="Times New Roman" w:cs="Times New Roman"/>
               </w:rPr>
@@ -2480,7 +2336,8 @@
             <w:pPr>
               <w:pStyle w:val="Compact"/>
               <w:spacing w:before="0" w:after="0"/>
-              <w:jc w:val="center"/>
+              <w:contextualSpacing/>
+              <w:jc w:val="right"/>
               <w:rPr>
                 <w:rFonts w:ascii="Times New Roman" w:hAnsi="Times New Roman" w:cs="Times New Roman"/>
               </w:rPr>
@@ -2501,7 +2358,7 @@
             <w:pPr>
               <w:pStyle w:val="Compact"/>
               <w:spacing w:before="0" w:after="0"/>
-              <w:jc w:val="center"/>
+              <w:contextualSpacing/>
               <w:rPr>
                 <w:rFonts w:ascii="Times New Roman" w:hAnsi="Times New Roman" w:cs="Times New Roman"/>
               </w:rPr>
@@ -2522,7 +2379,7 @@
             <w:pPr>
               <w:pStyle w:val="Compact"/>
               <w:spacing w:before="0" w:after="0"/>
-              <w:jc w:val="center"/>
+              <w:contextualSpacing/>
               <w:rPr>
                 <w:rFonts w:ascii="Times New Roman" w:hAnsi="Times New Roman" w:cs="Times New Roman"/>
               </w:rPr>
@@ -2543,7 +2400,7 @@
             <w:pPr>
               <w:pStyle w:val="Compact"/>
               <w:spacing w:before="0" w:after="0"/>
-              <w:jc w:val="center"/>
+              <w:contextualSpacing/>
               <w:rPr>
                 <w:rFonts w:ascii="Times New Roman" w:hAnsi="Times New Roman" w:cs="Times New Roman"/>
               </w:rPr>
@@ -2566,7 +2423,7 @@
             <w:pPr>
               <w:pStyle w:val="Compact"/>
               <w:spacing w:before="0" w:after="0"/>
-              <w:jc w:val="center"/>
+              <w:contextualSpacing/>
               <w:rPr>
                 <w:rFonts w:ascii="Times New Roman" w:hAnsi="Times New Roman" w:cs="Times New Roman"/>
               </w:rPr>
@@ -2587,7 +2444,8 @@
             <w:pPr>
               <w:pStyle w:val="Compact"/>
               <w:spacing w:before="0" w:after="0"/>
-              <w:jc w:val="center"/>
+              <w:contextualSpacing/>
+              <w:jc w:val="right"/>
               <w:rPr>
                 <w:rFonts w:ascii="Times New Roman" w:hAnsi="Times New Roman" w:cs="Times New Roman"/>
               </w:rPr>
@@ -2608,7 +2466,7 @@
             <w:pPr>
               <w:pStyle w:val="Compact"/>
               <w:spacing w:before="0" w:after="0"/>
-              <w:jc w:val="center"/>
+              <w:contextualSpacing/>
               <w:rPr>
                 <w:rFonts w:ascii="Times New Roman" w:hAnsi="Times New Roman" w:cs="Times New Roman"/>
               </w:rPr>
@@ -2629,7 +2487,7 @@
             <w:pPr>
               <w:pStyle w:val="Compact"/>
               <w:spacing w:before="0" w:after="0"/>
-              <w:jc w:val="center"/>
+              <w:contextualSpacing/>
               <w:rPr>
                 <w:rFonts w:ascii="Times New Roman" w:hAnsi="Times New Roman" w:cs="Times New Roman"/>
               </w:rPr>
@@ -2650,7 +2508,7 @@
             <w:pPr>
               <w:pStyle w:val="Compact"/>
               <w:spacing w:before="0" w:after="0"/>
-              <w:jc w:val="center"/>
+              <w:contextualSpacing/>
               <w:rPr>
                 <w:rFonts w:ascii="Times New Roman" w:hAnsi="Times New Roman" w:cs="Times New Roman"/>
               </w:rPr>
@@ -2673,7 +2531,7 @@
             <w:pPr>
               <w:pStyle w:val="Compact"/>
               <w:spacing w:before="0" w:after="0"/>
-              <w:jc w:val="center"/>
+              <w:contextualSpacing/>
               <w:rPr>
                 <w:rFonts w:ascii="Times New Roman" w:hAnsi="Times New Roman" w:cs="Times New Roman"/>
               </w:rPr>
@@ -2694,7 +2552,8 @@
             <w:pPr>
               <w:pStyle w:val="Compact"/>
               <w:spacing w:before="0" w:after="0"/>
-              <w:jc w:val="center"/>
+              <w:contextualSpacing/>
+              <w:jc w:val="right"/>
               <w:rPr>
                 <w:rFonts w:ascii="Times New Roman" w:hAnsi="Times New Roman" w:cs="Times New Roman"/>
               </w:rPr>
@@ -2715,7 +2574,7 @@
             <w:pPr>
               <w:pStyle w:val="Compact"/>
               <w:spacing w:before="0" w:after="0"/>
-              <w:jc w:val="center"/>
+              <w:contextualSpacing/>
               <w:rPr>
                 <w:rFonts w:ascii="Times New Roman" w:hAnsi="Times New Roman" w:cs="Times New Roman"/>
               </w:rPr>
@@ -2736,7 +2595,7 @@
             <w:pPr>
               <w:pStyle w:val="Compact"/>
               <w:spacing w:before="0" w:after="0"/>
-              <w:jc w:val="center"/>
+              <w:contextualSpacing/>
               <w:rPr>
                 <w:rFonts w:ascii="Times New Roman" w:hAnsi="Times New Roman" w:cs="Times New Roman"/>
               </w:rPr>
@@ -2757,7 +2616,7 @@
             <w:pPr>
               <w:pStyle w:val="Compact"/>
               <w:spacing w:before="0" w:after="0"/>
-              <w:jc w:val="center"/>
+              <w:contextualSpacing/>
               <w:rPr>
                 <w:rFonts w:ascii="Times New Roman" w:hAnsi="Times New Roman" w:cs="Times New Roman"/>
               </w:rPr>
@@ -2780,7 +2639,7 @@
             <w:pPr>
               <w:pStyle w:val="Compact"/>
               <w:spacing w:before="0" w:after="0"/>
-              <w:jc w:val="center"/>
+              <w:contextualSpacing/>
               <w:rPr>
                 <w:rFonts w:ascii="Times New Roman" w:hAnsi="Times New Roman" w:cs="Times New Roman"/>
               </w:rPr>
@@ -2801,7 +2660,8 @@
             <w:pPr>
               <w:pStyle w:val="Compact"/>
               <w:spacing w:before="0" w:after="0"/>
-              <w:jc w:val="center"/>
+              <w:contextualSpacing/>
+              <w:jc w:val="right"/>
               <w:rPr>
                 <w:rFonts w:ascii="Times New Roman" w:hAnsi="Times New Roman" w:cs="Times New Roman"/>
               </w:rPr>
@@ -2822,7 +2682,7 @@
             <w:pPr>
               <w:pStyle w:val="Compact"/>
               <w:spacing w:before="0" w:after="0"/>
-              <w:jc w:val="center"/>
+              <w:contextualSpacing/>
               <w:rPr>
                 <w:rFonts w:ascii="Times New Roman" w:hAnsi="Times New Roman" w:cs="Times New Roman"/>
               </w:rPr>
@@ -2843,7 +2703,7 @@
             <w:pPr>
               <w:pStyle w:val="Compact"/>
               <w:spacing w:before="0" w:after="0"/>
-              <w:jc w:val="center"/>
+              <w:contextualSpacing/>
               <w:rPr>
                 <w:rFonts w:ascii="Times New Roman" w:hAnsi="Times New Roman" w:cs="Times New Roman"/>
               </w:rPr>
@@ -2864,7 +2724,7 @@
             <w:pPr>
               <w:pStyle w:val="Compact"/>
               <w:spacing w:before="0" w:after="0"/>
-              <w:jc w:val="center"/>
+              <w:contextualSpacing/>
               <w:rPr>
                 <w:rFonts w:ascii="Times New Roman" w:hAnsi="Times New Roman" w:cs="Times New Roman"/>
               </w:rPr>
@@ -2887,7 +2747,7 @@
             <w:pPr>
               <w:pStyle w:val="Compact"/>
               <w:spacing w:before="0" w:after="0"/>
-              <w:jc w:val="center"/>
+              <w:contextualSpacing/>
               <w:rPr>
                 <w:rFonts w:ascii="Times New Roman" w:hAnsi="Times New Roman" w:cs="Times New Roman"/>
               </w:rPr>
@@ -2908,7 +2768,8 @@
             <w:pPr>
               <w:pStyle w:val="Compact"/>
               <w:spacing w:before="0" w:after="0"/>
-              <w:jc w:val="center"/>
+              <w:contextualSpacing/>
+              <w:jc w:val="right"/>
               <w:rPr>
                 <w:rFonts w:ascii="Times New Roman" w:hAnsi="Times New Roman" w:cs="Times New Roman"/>
               </w:rPr>
@@ -2929,7 +2790,7 @@
             <w:pPr>
               <w:pStyle w:val="Compact"/>
               <w:spacing w:before="0" w:after="0"/>
-              <w:jc w:val="center"/>
+              <w:contextualSpacing/>
               <w:rPr>
                 <w:rFonts w:ascii="Times New Roman" w:hAnsi="Times New Roman" w:cs="Times New Roman"/>
               </w:rPr>
@@ -2950,7 +2811,7 @@
             <w:pPr>
               <w:pStyle w:val="Compact"/>
               <w:spacing w:before="0" w:after="0"/>
-              <w:jc w:val="center"/>
+              <w:contextualSpacing/>
               <w:rPr>
                 <w:rFonts w:ascii="Times New Roman" w:hAnsi="Times New Roman" w:cs="Times New Roman"/>
               </w:rPr>
@@ -2971,7 +2832,7 @@
             <w:pPr>
               <w:pStyle w:val="Compact"/>
               <w:spacing w:before="0" w:after="0"/>
-              <w:jc w:val="center"/>
+              <w:contextualSpacing/>
               <w:rPr>
                 <w:rFonts w:ascii="Times New Roman" w:hAnsi="Times New Roman" w:cs="Times New Roman"/>
               </w:rPr>
@@ -2989,15 +2850,12 @@
         <w:tc>
           <w:tcPr>
             <w:tcW w:w="0" w:type="auto"/>
-            <w:tcBorders>
-              <w:bottom w:val="single" w:sz="4" w:space="0" w:color="auto"/>
-            </w:tcBorders>
-          </w:tcPr>
-          <w:p>
-            <w:pPr>
-              <w:pStyle w:val="Compact"/>
-              <w:spacing w:before="0" w:after="0"/>
-              <w:jc w:val="center"/>
+          </w:tcPr>
+          <w:p>
+            <w:pPr>
+              <w:pStyle w:val="Compact"/>
+              <w:spacing w:before="0" w:after="0"/>
+              <w:contextualSpacing/>
               <w:rPr>
                 <w:rFonts w:ascii="Times New Roman" w:hAnsi="Times New Roman" w:cs="Times New Roman"/>
               </w:rPr>
@@ -3013,15 +2871,13 @@
         <w:tc>
           <w:tcPr>
             <w:tcW w:w="0" w:type="auto"/>
-            <w:tcBorders>
-              <w:bottom w:val="single" w:sz="4" w:space="0" w:color="auto"/>
-            </w:tcBorders>
-          </w:tcPr>
-          <w:p>
-            <w:pPr>
-              <w:pStyle w:val="Compact"/>
-              <w:spacing w:before="0" w:after="0"/>
-              <w:jc w:val="center"/>
+          </w:tcPr>
+          <w:p>
+            <w:pPr>
+              <w:pStyle w:val="Compact"/>
+              <w:spacing w:before="0" w:after="0"/>
+              <w:contextualSpacing/>
+              <w:jc w:val="right"/>
               <w:rPr>
                 <w:rFonts w:ascii="Times New Roman" w:hAnsi="Times New Roman" w:cs="Times New Roman"/>
               </w:rPr>
@@ -3037,15 +2893,12 @@
         <w:tc>
           <w:tcPr>
             <w:tcW w:w="0" w:type="auto"/>
-            <w:tcBorders>
-              <w:bottom w:val="single" w:sz="4" w:space="0" w:color="auto"/>
-            </w:tcBorders>
-          </w:tcPr>
-          <w:p>
-            <w:pPr>
-              <w:pStyle w:val="Compact"/>
-              <w:spacing w:before="0" w:after="0"/>
-              <w:jc w:val="center"/>
+          </w:tcPr>
+          <w:p>
+            <w:pPr>
+              <w:pStyle w:val="Compact"/>
+              <w:spacing w:before="0" w:after="0"/>
+              <w:contextualSpacing/>
               <w:rPr>
                 <w:rFonts w:ascii="Times New Roman" w:hAnsi="Times New Roman" w:cs="Times New Roman"/>
               </w:rPr>
@@ -3061,15 +2914,12 @@
         <w:tc>
           <w:tcPr>
             <w:tcW w:w="0" w:type="auto"/>
-            <w:tcBorders>
-              <w:bottom w:val="single" w:sz="4" w:space="0" w:color="auto"/>
-            </w:tcBorders>
-          </w:tcPr>
-          <w:p>
-            <w:pPr>
-              <w:pStyle w:val="Compact"/>
-              <w:spacing w:before="0" w:after="0"/>
-              <w:jc w:val="center"/>
+          </w:tcPr>
+          <w:p>
+            <w:pPr>
+              <w:pStyle w:val="Compact"/>
+              <w:spacing w:before="0" w:after="0"/>
+              <w:contextualSpacing/>
               <w:rPr>
                 <w:rFonts w:ascii="Times New Roman" w:hAnsi="Times New Roman" w:cs="Times New Roman"/>
               </w:rPr>
@@ -3085,15 +2935,12 @@
         <w:tc>
           <w:tcPr>
             <w:tcW w:w="0" w:type="auto"/>
-            <w:tcBorders>
-              <w:bottom w:val="single" w:sz="4" w:space="0" w:color="auto"/>
-            </w:tcBorders>
-          </w:tcPr>
-          <w:p>
-            <w:pPr>
-              <w:pStyle w:val="Compact"/>
-              <w:spacing w:before="0" w:after="0"/>
-              <w:jc w:val="center"/>
+          </w:tcPr>
+          <w:p>
+            <w:pPr>
+              <w:pStyle w:val="Compact"/>
+              <w:spacing w:before="0" w:after="0"/>
+              <w:contextualSpacing/>
               <w:rPr>
                 <w:rFonts w:ascii="Times New Roman" w:hAnsi="Times New Roman" w:cs="Times New Roman"/>
               </w:rPr>
@@ -3111,16 +2958,12 @@
         <w:tc>
           <w:tcPr>
             <w:tcW w:w="0" w:type="auto"/>
-            <w:tcBorders>
-              <w:top w:val="single" w:sz="4" w:space="0" w:color="auto"/>
-              <w:bottom w:val="single" w:sz="4" w:space="0" w:color="auto"/>
-            </w:tcBorders>
-          </w:tcPr>
-          <w:p>
-            <w:pPr>
-              <w:pStyle w:val="Compact"/>
-              <w:spacing w:before="0" w:after="0"/>
-              <w:jc w:val="center"/>
+          </w:tcPr>
+          <w:p>
+            <w:pPr>
+              <w:pStyle w:val="Compact"/>
+              <w:spacing w:before="0" w:after="0"/>
+              <w:contextualSpacing/>
               <w:rPr>
                 <w:rFonts w:ascii="Times New Roman" w:hAnsi="Times New Roman" w:cs="Times New Roman"/>
               </w:rPr>
@@ -3136,16 +2979,13 @@
         <w:tc>
           <w:tcPr>
             <w:tcW w:w="0" w:type="auto"/>
-            <w:tcBorders>
-              <w:top w:val="single" w:sz="4" w:space="0" w:color="auto"/>
-              <w:bottom w:val="single" w:sz="4" w:space="0" w:color="auto"/>
-            </w:tcBorders>
-          </w:tcPr>
-          <w:p>
-            <w:pPr>
-              <w:pStyle w:val="Compact"/>
-              <w:spacing w:before="0" w:after="0"/>
-              <w:jc w:val="center"/>
+          </w:tcPr>
+          <w:p>
+            <w:pPr>
+              <w:pStyle w:val="Compact"/>
+              <w:spacing w:before="0" w:after="0"/>
+              <w:contextualSpacing/>
+              <w:jc w:val="right"/>
               <w:rPr>
                 <w:rFonts w:ascii="Times New Roman" w:hAnsi="Times New Roman" w:cs="Times New Roman"/>
               </w:rPr>
@@ -3161,54 +3001,42 @@
         <w:tc>
           <w:tcPr>
             <w:tcW w:w="0" w:type="auto"/>
-            <w:tcBorders>
-              <w:top w:val="single" w:sz="4" w:space="0" w:color="auto"/>
-              <w:bottom w:val="single" w:sz="4" w:space="0" w:color="auto"/>
-            </w:tcBorders>
-          </w:tcPr>
-          <w:p>
-            <w:pPr>
-              <w:pStyle w:val="Compact"/>
-              <w:spacing w:before="0" w:after="0"/>
-              <w:jc w:val="center"/>
-              <w:rPr>
-                <w:rFonts w:ascii="Times New Roman" w:hAnsi="Times New Roman" w:cs="Times New Roman"/>
-              </w:rPr>
-            </w:pPr>
-          </w:p>
-        </w:tc>
-        <w:tc>
-          <w:tcPr>
-            <w:tcW w:w="0" w:type="auto"/>
-            <w:tcBorders>
-              <w:top w:val="single" w:sz="4" w:space="0" w:color="auto"/>
-              <w:bottom w:val="single" w:sz="4" w:space="0" w:color="auto"/>
-            </w:tcBorders>
-          </w:tcPr>
-          <w:p>
-            <w:pPr>
-              <w:pStyle w:val="Compact"/>
-              <w:spacing w:before="0" w:after="0"/>
-              <w:jc w:val="center"/>
-              <w:rPr>
-                <w:rFonts w:ascii="Times New Roman" w:hAnsi="Times New Roman" w:cs="Times New Roman"/>
-              </w:rPr>
-            </w:pPr>
-          </w:p>
-        </w:tc>
-        <w:tc>
-          <w:tcPr>
-            <w:tcW w:w="0" w:type="auto"/>
-            <w:tcBorders>
-              <w:top w:val="single" w:sz="4" w:space="0" w:color="auto"/>
-              <w:bottom w:val="single" w:sz="4" w:space="0" w:color="auto"/>
-            </w:tcBorders>
-          </w:tcPr>
-          <w:p>
-            <w:pPr>
-              <w:pStyle w:val="Compact"/>
-              <w:spacing w:before="0" w:after="0"/>
-              <w:jc w:val="center"/>
+          </w:tcPr>
+          <w:p>
+            <w:pPr>
+              <w:pStyle w:val="Compact"/>
+              <w:spacing w:before="0" w:after="0"/>
+              <w:contextualSpacing/>
+              <w:rPr>
+                <w:rFonts w:ascii="Times New Roman" w:hAnsi="Times New Roman" w:cs="Times New Roman"/>
+              </w:rPr>
+            </w:pPr>
+          </w:p>
+        </w:tc>
+        <w:tc>
+          <w:tcPr>
+            <w:tcW w:w="0" w:type="auto"/>
+          </w:tcPr>
+          <w:p>
+            <w:pPr>
+              <w:pStyle w:val="Compact"/>
+              <w:spacing w:before="0" w:after="0"/>
+              <w:contextualSpacing/>
+              <w:rPr>
+                <w:rFonts w:ascii="Times New Roman" w:hAnsi="Times New Roman" w:cs="Times New Roman"/>
+              </w:rPr>
+            </w:pPr>
+          </w:p>
+        </w:tc>
+        <w:tc>
+          <w:tcPr>
+            <w:tcW w:w="0" w:type="auto"/>
+          </w:tcPr>
+          <w:p>
+            <w:pPr>
+              <w:pStyle w:val="Compact"/>
+              <w:spacing w:before="0" w:after="0"/>
+              <w:contextualSpacing/>
               <w:rPr>
                 <w:rFonts w:ascii="Times New Roman" w:hAnsi="Times New Roman" w:cs="Times New Roman"/>
               </w:rPr>
@@ -3219,63 +3047,9 @@
     </w:tbl>
     <w:p>
       <w:pPr>
-        <w:pStyle w:val="Compact"/>
+        <w:pStyle w:val="BodyText"/>
         <w:spacing w:before="0" w:after="0"/>
-        <w:rPr>
-          <w:rFonts w:ascii="Times New Roman" w:hAnsi="Times New Roman" w:cs="Times New Roman"/>
-        </w:rPr>
-      </w:pPr>
-    </w:p>
-    <w:p>
-      <w:pPr>
-        <w:spacing w:after="0"/>
-        <w:rPr>
-          <w:rFonts w:ascii="Times New Roman" w:hAnsi="Times New Roman" w:cs="Times New Roman"/>
-        </w:rPr>
-      </w:pPr>
-      <w:r>
-        <w:rPr>
-          <w:rFonts w:ascii="Times New Roman" w:hAnsi="Times New Roman" w:cs="Times New Roman"/>
-          <w:i/>
-          <w:iCs/>
-        </w:rPr>
-        <w:t>Note.</w:t>
-      </w:r>
-      <w:r>
-        <w:rPr>
-          <w:rFonts w:ascii="Times New Roman" w:hAnsi="Times New Roman" w:cs="Times New Roman"/>
-          <w:i/>
-          <w:iCs/>
-        </w:rPr>
-        <w:t xml:space="preserve"> </w:t>
-      </w:r>
-      <w:r>
-        <w:rPr>
-          <w:rFonts w:ascii="Times New Roman" w:hAnsi="Times New Roman" w:cs="Times New Roman"/>
-        </w:rPr>
-        <w:t>These trees are tall.</w:t>
-      </w:r>
-    </w:p>
-    <w:p>
-      <w:pPr>
-        <w:pStyle w:val="Compact"/>
-        <w:spacing w:before="0" w:after="0"/>
-        <w:rPr>
-          <w:rFonts w:ascii="Times New Roman" w:hAnsi="Times New Roman" w:cs="Times New Roman"/>
-        </w:rPr>
-      </w:pPr>
-    </w:p>
-    <w:p>
-      <w:pPr>
-        <w:pStyle w:val="Compact"/>
-        <w:spacing w:before="0" w:after="0"/>
-        <w:rPr>
-          <w:rFonts w:ascii="Times New Roman" w:hAnsi="Times New Roman" w:cs="Times New Roman"/>
-        </w:rPr>
-      </w:pPr>
-    </w:p>
-    <w:p>
-      <w:pPr>
+        <w:contextualSpacing/>
         <w:rPr>
           <w:rFonts w:ascii="Times New Roman" w:hAnsi="Times New Roman" w:cs="Times New Roman"/>
         </w:rPr>
@@ -3284,41 +3058,14 @@
         <w:rPr>
           <w:rFonts w:ascii="Times New Roman" w:hAnsi="Times New Roman" w:cs="Times New Roman"/>
         </w:rPr>
-        <w:br w:type="page"/>
+        <w:t>C) Make a frequency distribution graph with the normal curve superimposed on it. Plot the scores on the x axis and the frequency on the y axis. Make sure your graph is presented in APA style. Do not group the data into intervals. Finally,describe the distribution as you have been instructed in class (not as ‘pretty,’ ‘fun,’ ‘strange,’ etc.). (30 points)</w:t>
       </w:r>
     </w:p>
     <w:p>
       <w:pPr>
-        <w:pStyle w:val="Compact"/>
+        <w:pStyle w:val="BodyText"/>
         <w:spacing w:before="0" w:after="0"/>
-        <w:rPr>
-          <w:rFonts w:ascii="Times New Roman" w:hAnsi="Times New Roman" w:cs="Times New Roman"/>
-        </w:rPr>
-      </w:pPr>
-    </w:p>
-    <w:p>
-      <w:pPr>
-        <w:pStyle w:val="Compact"/>
-        <w:numPr>
-          <w:ilvl w:val="0"/>
-          <w:numId w:val="5"/>
-        </w:numPr>
-        <w:spacing w:before="0" w:after="0"/>
-        <w:rPr>
-          <w:rFonts w:ascii="Times New Roman" w:hAnsi="Times New Roman" w:cs="Times New Roman"/>
-        </w:rPr>
-      </w:pPr>
-      <w:r>
-        <w:rPr>
-          <w:rFonts w:ascii="Times New Roman" w:hAnsi="Times New Roman" w:cs="Times New Roman"/>
-        </w:rPr>
-        <w:t>Make a frequency distribution graph with the normal curve superimposed on it. Plot the scores on the x axis and the frequency on the y axis. Make sure your graph is presented in APA style. Do not group the data into intervals. (30 points)</w:t>
-      </w:r>
-    </w:p>
-    <w:p>
-      <w:pPr>
-        <w:pStyle w:val="FirstParagraph"/>
-        <w:spacing w:before="0" w:after="0"/>
+        <w:contextualSpacing/>
         <w:rPr>
           <w:rFonts w:ascii="Times New Roman" w:hAnsi="Times New Roman" w:cs="Times New Roman"/>
         </w:rPr>
@@ -3328,9 +3075,10 @@
           <w:rFonts w:ascii="Times New Roman" w:hAnsi="Times New Roman" w:cs="Times New Roman"/>
           <w:noProof/>
         </w:rPr>
+        <w:lastRenderedPageBreak/>
         <w:drawing>
-          <wp:inline distT="0" distB="0" distL="0" distR="0" wp14:anchorId="5D8A9F72" wp14:editId="0DF68DF3">
-            <wp:extent cx="3379622" cy="2820010"/>
+          <wp:inline distT="0" distB="0" distL="0" distR="0" wp14:anchorId="1E6B3370" wp14:editId="11A12542">
+            <wp:extent cx="4620126" cy="3696101"/>
             <wp:effectExtent l="0" t="0" r="0" b="0"/>
             <wp:docPr id="21" name="Picture"/>
             <wp:cNvGraphicFramePr/>
@@ -3352,7 +3100,7 @@
                   <pic:spPr bwMode="auto">
                     <a:xfrm>
                       <a:off x="0" y="0"/>
-                      <a:ext cx="3389212" cy="2828012"/>
+                      <a:ext cx="4620126" cy="3696101"/>
                     </a:xfrm>
                     <a:prstGeom prst="rect">
                       <a:avLst/>
@@ -3372,18 +3120,10 @@
       </w:r>
     </w:p>
     <w:p>
-      <w:r>
-        <w:br w:type="page"/>
-      </w:r>
-    </w:p>
-    <w:p>
       <w:pPr>
-        <w:pStyle w:val="Compact"/>
-        <w:numPr>
-          <w:ilvl w:val="0"/>
-          <w:numId w:val="6"/>
-        </w:numPr>
+        <w:pStyle w:val="BodyText"/>
         <w:spacing w:before="0" w:after="0"/>
+        <w:contextualSpacing/>
         <w:rPr>
           <w:rFonts w:ascii="Times New Roman" w:hAnsi="Times New Roman" w:cs="Times New Roman"/>
         </w:rPr>
@@ -3392,14 +3132,14 @@
         <w:rPr>
           <w:rFonts w:ascii="Times New Roman" w:hAnsi="Times New Roman" w:cs="Times New Roman"/>
         </w:rPr>
-        <w:lastRenderedPageBreak/>
-        <w:t>Make a histogram of the frequency data. Looking at the histogram, describe the distribution as you have been instructed in class (not as ‘pretty,’ ‘fun,’ ‘strange,’ etc.). (15 points)</w:t>
+        <w:t>D) Make a histogram of the frequency data. Looking at the histogram, describe the distribution as you have been instructed in class (not as ‘pretty,’ ‘fun,’ ‘strange,’ etc.). (15 points)</w:t>
       </w:r>
     </w:p>
     <w:p>
       <w:pPr>
-        <w:pStyle w:val="FirstParagraph"/>
+        <w:pStyle w:val="BodyText"/>
         <w:spacing w:before="0" w:after="0"/>
+        <w:contextualSpacing/>
         <w:rPr>
           <w:rFonts w:ascii="Times New Roman" w:hAnsi="Times New Roman" w:cs="Times New Roman"/>
         </w:rPr>
@@ -3410,7 +3150,7 @@
           <w:noProof/>
         </w:rPr>
         <w:drawing>
-          <wp:inline distT="0" distB="0" distL="0" distR="0" wp14:anchorId="55AC3F9B" wp14:editId="4C10FA25">
+          <wp:inline distT="0" distB="0" distL="0" distR="0" wp14:anchorId="6E1F1915" wp14:editId="3A123F1A">
             <wp:extent cx="4620126" cy="3696101"/>
             <wp:effectExtent l="0" t="0" r="0" b="0"/>
             <wp:docPr id="24" name="Picture"/>
@@ -3454,12 +3194,9 @@
     </w:p>
     <w:p>
       <w:pPr>
-        <w:pStyle w:val="Compact"/>
-        <w:numPr>
-          <w:ilvl w:val="0"/>
-          <w:numId w:val="7"/>
-        </w:numPr>
+        <w:pStyle w:val="BodyText"/>
         <w:spacing w:before="0" w:after="0"/>
+        <w:contextualSpacing/>
         <w:rPr>
           <w:rFonts w:ascii="Times New Roman" w:hAnsi="Times New Roman" w:cs="Times New Roman"/>
         </w:rPr>
@@ -3468,13 +3205,14 @@
         <w:rPr>
           <w:rFonts w:ascii="Times New Roman" w:hAnsi="Times New Roman" w:cs="Times New Roman"/>
         </w:rPr>
-        <w:t>Make a boxplot. (10 points)</w:t>
+        <w:t>E) Make a boxplot. (10 points)</w:t>
       </w:r>
     </w:p>
     <w:p>
       <w:pPr>
-        <w:pStyle w:val="FirstParagraph"/>
+        <w:pStyle w:val="BodyText"/>
         <w:spacing w:before="0" w:after="0"/>
+        <w:contextualSpacing/>
         <w:rPr>
           <w:rFonts w:ascii="Times New Roman" w:hAnsi="Times New Roman" w:cs="Times New Roman"/>
         </w:rPr>
@@ -3484,8 +3222,9 @@
           <w:rFonts w:ascii="Times New Roman" w:hAnsi="Times New Roman" w:cs="Times New Roman"/>
           <w:noProof/>
         </w:rPr>
+        <w:lastRenderedPageBreak/>
         <w:drawing>
-          <wp:inline distT="0" distB="0" distL="0" distR="0" wp14:anchorId="4259394E" wp14:editId="73F83355">
+          <wp:inline distT="0" distB="0" distL="0" distR="0" wp14:anchorId="690BA7AD" wp14:editId="7F2C92E0">
             <wp:extent cx="4620126" cy="3696101"/>
             <wp:effectExtent l="0" t="0" r="0" b="0"/>
             <wp:docPr id="27" name="Picture"/>
@@ -3544,7 +3283,7 @@
   <w:abstractNum w:abstractNumId="0" w15:restartNumberingAfterBreak="0">
     <w:nsid w:val="0000A990"/>
     <w:multiLevelType w:val="multilevel"/>
-    <w:tmpl w:val="999A4F4A"/>
+    <w:tmpl w:val="2E4EC7E4"/>
     <w:lvl w:ilvl="0">
       <w:numFmt w:val="bullet"/>
       <w:lvlText w:val=" "/>
@@ -3618,704 +3357,8 @@
       </w:pPr>
     </w:lvl>
   </w:abstractNum>
-  <w:abstractNum w:abstractNumId="1" w15:restartNumberingAfterBreak="0">
-    <w:nsid w:val="00A99411"/>
-    <w:multiLevelType w:val="multilevel"/>
-    <w:tmpl w:val="67C09F1C"/>
-    <w:lvl w:ilvl="0">
-      <w:start w:val="1"/>
-      <w:numFmt w:val="decimal"/>
-      <w:lvlText w:val="%1."/>
-      <w:lvlJc w:val="left"/>
-      <w:pPr>
-        <w:ind w:left="720" w:hanging="360"/>
-      </w:pPr>
-    </w:lvl>
-    <w:lvl w:ilvl="1">
-      <w:start w:val="1"/>
-      <w:numFmt w:val="decimal"/>
-      <w:lvlText w:val="%2."/>
-      <w:lvlJc w:val="left"/>
-      <w:pPr>
-        <w:ind w:left="1440" w:hanging="360"/>
-      </w:pPr>
-    </w:lvl>
-    <w:lvl w:ilvl="2">
-      <w:start w:val="1"/>
-      <w:numFmt w:val="decimal"/>
-      <w:lvlText w:val="%3."/>
-      <w:lvlJc w:val="left"/>
-      <w:pPr>
-        <w:ind w:left="2160" w:hanging="360"/>
-      </w:pPr>
-    </w:lvl>
-    <w:lvl w:ilvl="3">
-      <w:start w:val="1"/>
-      <w:numFmt w:val="decimal"/>
-      <w:lvlText w:val="%4."/>
-      <w:lvlJc w:val="left"/>
-      <w:pPr>
-        <w:ind w:left="2880" w:hanging="360"/>
-      </w:pPr>
-    </w:lvl>
-    <w:lvl w:ilvl="4">
-      <w:start w:val="1"/>
-      <w:numFmt w:val="decimal"/>
-      <w:lvlText w:val="%5."/>
-      <w:lvlJc w:val="left"/>
-      <w:pPr>
-        <w:ind w:left="3600" w:hanging="360"/>
-      </w:pPr>
-    </w:lvl>
-    <w:lvl w:ilvl="5">
-      <w:start w:val="1"/>
-      <w:numFmt w:val="decimal"/>
-      <w:lvlText w:val="%6."/>
-      <w:lvlJc w:val="left"/>
-      <w:pPr>
-        <w:ind w:left="4320" w:hanging="360"/>
-      </w:pPr>
-    </w:lvl>
-    <w:lvl w:ilvl="6">
-      <w:start w:val="1"/>
-      <w:numFmt w:val="decimal"/>
-      <w:lvlText w:val="%7."/>
-      <w:lvlJc w:val="left"/>
-      <w:pPr>
-        <w:ind w:left="5040" w:hanging="360"/>
-      </w:pPr>
-    </w:lvl>
-    <w:lvl w:ilvl="7">
-      <w:start w:val="1"/>
-      <w:numFmt w:val="decimal"/>
-      <w:lvlText w:val="%8."/>
-      <w:lvlJc w:val="left"/>
-      <w:pPr>
-        <w:ind w:left="5760" w:hanging="360"/>
-      </w:pPr>
-    </w:lvl>
-    <w:lvl w:ilvl="8">
-      <w:start w:val="1"/>
-      <w:numFmt w:val="decimal"/>
-      <w:lvlText w:val="%9."/>
-      <w:lvlJc w:val="left"/>
-      <w:pPr>
-        <w:ind w:left="6480" w:hanging="360"/>
-      </w:pPr>
-    </w:lvl>
-  </w:abstractNum>
-  <w:abstractNum w:abstractNumId="2" w15:restartNumberingAfterBreak="0">
-    <w:nsid w:val="00A99821"/>
-    <w:multiLevelType w:val="multilevel"/>
-    <w:tmpl w:val="87207DBE"/>
-    <w:lvl w:ilvl="0">
-      <w:start w:val="1"/>
-      <w:numFmt w:val="upperLetter"/>
-      <w:lvlText w:val="%1)"/>
-      <w:lvlJc w:val="left"/>
-      <w:pPr>
-        <w:ind w:left="720" w:hanging="360"/>
-      </w:pPr>
-    </w:lvl>
-    <w:lvl w:ilvl="1">
-      <w:start w:val="1"/>
-      <w:numFmt w:val="upperLetter"/>
-      <w:lvlText w:val="%2)"/>
-      <w:lvlJc w:val="left"/>
-      <w:pPr>
-        <w:ind w:left="1440" w:hanging="360"/>
-      </w:pPr>
-    </w:lvl>
-    <w:lvl w:ilvl="2">
-      <w:start w:val="1"/>
-      <w:numFmt w:val="upperLetter"/>
-      <w:lvlText w:val="%3)"/>
-      <w:lvlJc w:val="left"/>
-      <w:pPr>
-        <w:ind w:left="2160" w:hanging="360"/>
-      </w:pPr>
-    </w:lvl>
-    <w:lvl w:ilvl="3">
-      <w:start w:val="1"/>
-      <w:numFmt w:val="upperLetter"/>
-      <w:lvlText w:val="%4)"/>
-      <w:lvlJc w:val="left"/>
-      <w:pPr>
-        <w:ind w:left="2880" w:hanging="360"/>
-      </w:pPr>
-    </w:lvl>
-    <w:lvl w:ilvl="4">
-      <w:start w:val="1"/>
-      <w:numFmt w:val="upperLetter"/>
-      <w:lvlText w:val="%5)"/>
-      <w:lvlJc w:val="left"/>
-      <w:pPr>
-        <w:ind w:left="3600" w:hanging="360"/>
-      </w:pPr>
-    </w:lvl>
-    <w:lvl w:ilvl="5">
-      <w:start w:val="1"/>
-      <w:numFmt w:val="upperLetter"/>
-      <w:lvlText w:val="%6)"/>
-      <w:lvlJc w:val="left"/>
-      <w:pPr>
-        <w:ind w:left="4320" w:hanging="360"/>
-      </w:pPr>
-    </w:lvl>
-    <w:lvl w:ilvl="6">
-      <w:start w:val="1"/>
-      <w:numFmt w:val="upperLetter"/>
-      <w:lvlText w:val="%7)"/>
-      <w:lvlJc w:val="left"/>
-      <w:pPr>
-        <w:ind w:left="5040" w:hanging="360"/>
-      </w:pPr>
-    </w:lvl>
-    <w:lvl w:ilvl="7">
-      <w:start w:val="1"/>
-      <w:numFmt w:val="upperLetter"/>
-      <w:lvlText w:val="%8)"/>
-      <w:lvlJc w:val="left"/>
-      <w:pPr>
-        <w:ind w:left="5760" w:hanging="360"/>
-      </w:pPr>
-    </w:lvl>
-    <w:lvl w:ilvl="8">
-      <w:start w:val="1"/>
-      <w:numFmt w:val="upperLetter"/>
-      <w:lvlText w:val="%9)"/>
-      <w:lvlJc w:val="left"/>
-      <w:pPr>
-        <w:ind w:left="6480" w:hanging="360"/>
-      </w:pPr>
-    </w:lvl>
-  </w:abstractNum>
-  <w:abstractNum w:abstractNumId="3" w15:restartNumberingAfterBreak="0">
-    <w:nsid w:val="00A99822"/>
-    <w:multiLevelType w:val="multilevel"/>
-    <w:tmpl w:val="B6E897CE"/>
-    <w:lvl w:ilvl="0">
-      <w:start w:val="2"/>
-      <w:numFmt w:val="upperLetter"/>
-      <w:lvlText w:val="%1)"/>
-      <w:lvlJc w:val="left"/>
-      <w:pPr>
-        <w:ind w:left="720" w:hanging="360"/>
-      </w:pPr>
-    </w:lvl>
-    <w:lvl w:ilvl="1">
-      <w:start w:val="2"/>
-      <w:numFmt w:val="upperLetter"/>
-      <w:lvlText w:val="%2)"/>
-      <w:lvlJc w:val="left"/>
-      <w:pPr>
-        <w:ind w:left="1440" w:hanging="360"/>
-      </w:pPr>
-    </w:lvl>
-    <w:lvl w:ilvl="2">
-      <w:start w:val="2"/>
-      <w:numFmt w:val="upperLetter"/>
-      <w:lvlText w:val="%3)"/>
-      <w:lvlJc w:val="left"/>
-      <w:pPr>
-        <w:ind w:left="2160" w:hanging="360"/>
-      </w:pPr>
-    </w:lvl>
-    <w:lvl w:ilvl="3">
-      <w:start w:val="2"/>
-      <w:numFmt w:val="upperLetter"/>
-      <w:lvlText w:val="%4)"/>
-      <w:lvlJc w:val="left"/>
-      <w:pPr>
-        <w:ind w:left="2880" w:hanging="360"/>
-      </w:pPr>
-    </w:lvl>
-    <w:lvl w:ilvl="4">
-      <w:start w:val="2"/>
-      <w:numFmt w:val="upperLetter"/>
-      <w:lvlText w:val="%5)"/>
-      <w:lvlJc w:val="left"/>
-      <w:pPr>
-        <w:ind w:left="3600" w:hanging="360"/>
-      </w:pPr>
-    </w:lvl>
-    <w:lvl w:ilvl="5">
-      <w:start w:val="2"/>
-      <w:numFmt w:val="upperLetter"/>
-      <w:lvlText w:val="%6)"/>
-      <w:lvlJc w:val="left"/>
-      <w:pPr>
-        <w:ind w:left="4320" w:hanging="360"/>
-      </w:pPr>
-    </w:lvl>
-    <w:lvl w:ilvl="6">
-      <w:start w:val="2"/>
-      <w:numFmt w:val="upperLetter"/>
-      <w:lvlText w:val="%7)"/>
-      <w:lvlJc w:val="left"/>
-      <w:pPr>
-        <w:ind w:left="5040" w:hanging="360"/>
-      </w:pPr>
-    </w:lvl>
-    <w:lvl w:ilvl="7">
-      <w:start w:val="2"/>
-      <w:numFmt w:val="upperLetter"/>
-      <w:lvlText w:val="%8)"/>
-      <w:lvlJc w:val="left"/>
-      <w:pPr>
-        <w:ind w:left="5760" w:hanging="360"/>
-      </w:pPr>
-    </w:lvl>
-    <w:lvl w:ilvl="8">
-      <w:start w:val="2"/>
-      <w:numFmt w:val="upperLetter"/>
-      <w:lvlText w:val="%9)"/>
-      <w:lvlJc w:val="left"/>
-      <w:pPr>
-        <w:ind w:left="6480" w:hanging="360"/>
-      </w:pPr>
-    </w:lvl>
-  </w:abstractNum>
-  <w:abstractNum w:abstractNumId="4" w15:restartNumberingAfterBreak="0">
-    <w:nsid w:val="00A99823"/>
-    <w:multiLevelType w:val="multilevel"/>
-    <w:tmpl w:val="62D6310E"/>
-    <w:lvl w:ilvl="0">
-      <w:start w:val="3"/>
-      <w:numFmt w:val="upperLetter"/>
-      <w:lvlText w:val="%1)"/>
-      <w:lvlJc w:val="left"/>
-      <w:pPr>
-        <w:ind w:left="720" w:hanging="360"/>
-      </w:pPr>
-    </w:lvl>
-    <w:lvl w:ilvl="1">
-      <w:start w:val="3"/>
-      <w:numFmt w:val="upperLetter"/>
-      <w:lvlText w:val="%2)"/>
-      <w:lvlJc w:val="left"/>
-      <w:pPr>
-        <w:ind w:left="1440" w:hanging="360"/>
-      </w:pPr>
-    </w:lvl>
-    <w:lvl w:ilvl="2">
-      <w:start w:val="3"/>
-      <w:numFmt w:val="upperLetter"/>
-      <w:lvlText w:val="%3)"/>
-      <w:lvlJc w:val="left"/>
-      <w:pPr>
-        <w:ind w:left="2160" w:hanging="360"/>
-      </w:pPr>
-    </w:lvl>
-    <w:lvl w:ilvl="3">
-      <w:start w:val="3"/>
-      <w:numFmt w:val="upperLetter"/>
-      <w:lvlText w:val="%4)"/>
-      <w:lvlJc w:val="left"/>
-      <w:pPr>
-        <w:ind w:left="2880" w:hanging="360"/>
-      </w:pPr>
-    </w:lvl>
-    <w:lvl w:ilvl="4">
-      <w:start w:val="3"/>
-      <w:numFmt w:val="upperLetter"/>
-      <w:lvlText w:val="%5)"/>
-      <w:lvlJc w:val="left"/>
-      <w:pPr>
-        <w:ind w:left="3600" w:hanging="360"/>
-      </w:pPr>
-    </w:lvl>
-    <w:lvl w:ilvl="5">
-      <w:start w:val="3"/>
-      <w:numFmt w:val="upperLetter"/>
-      <w:lvlText w:val="%6)"/>
-      <w:lvlJc w:val="left"/>
-      <w:pPr>
-        <w:ind w:left="4320" w:hanging="360"/>
-      </w:pPr>
-    </w:lvl>
-    <w:lvl w:ilvl="6">
-      <w:start w:val="3"/>
-      <w:numFmt w:val="upperLetter"/>
-      <w:lvlText w:val="%7)"/>
-      <w:lvlJc w:val="left"/>
-      <w:pPr>
-        <w:ind w:left="5040" w:hanging="360"/>
-      </w:pPr>
-    </w:lvl>
-    <w:lvl w:ilvl="7">
-      <w:start w:val="3"/>
-      <w:numFmt w:val="upperLetter"/>
-      <w:lvlText w:val="%8)"/>
-      <w:lvlJc w:val="left"/>
-      <w:pPr>
-        <w:ind w:left="5760" w:hanging="360"/>
-      </w:pPr>
-    </w:lvl>
-    <w:lvl w:ilvl="8">
-      <w:start w:val="3"/>
-      <w:numFmt w:val="upperLetter"/>
-      <w:lvlText w:val="%9)"/>
-      <w:lvlJc w:val="left"/>
-      <w:pPr>
-        <w:ind w:left="6480" w:hanging="360"/>
-      </w:pPr>
-    </w:lvl>
-  </w:abstractNum>
-  <w:abstractNum w:abstractNumId="5" w15:restartNumberingAfterBreak="0">
-    <w:nsid w:val="00A99824"/>
-    <w:multiLevelType w:val="multilevel"/>
-    <w:tmpl w:val="4E5C9C4E"/>
-    <w:lvl w:ilvl="0">
-      <w:start w:val="4"/>
-      <w:numFmt w:val="upperLetter"/>
-      <w:lvlText w:val="%1)"/>
-      <w:lvlJc w:val="left"/>
-      <w:pPr>
-        <w:ind w:left="720" w:hanging="360"/>
-      </w:pPr>
-    </w:lvl>
-    <w:lvl w:ilvl="1">
-      <w:start w:val="4"/>
-      <w:numFmt w:val="upperLetter"/>
-      <w:lvlText w:val="%2)"/>
-      <w:lvlJc w:val="left"/>
-      <w:pPr>
-        <w:ind w:left="1440" w:hanging="360"/>
-      </w:pPr>
-    </w:lvl>
-    <w:lvl w:ilvl="2">
-      <w:start w:val="4"/>
-      <w:numFmt w:val="upperLetter"/>
-      <w:lvlText w:val="%3)"/>
-      <w:lvlJc w:val="left"/>
-      <w:pPr>
-        <w:ind w:left="2160" w:hanging="360"/>
-      </w:pPr>
-    </w:lvl>
-    <w:lvl w:ilvl="3">
-      <w:start w:val="4"/>
-      <w:numFmt w:val="upperLetter"/>
-      <w:lvlText w:val="%4)"/>
-      <w:lvlJc w:val="left"/>
-      <w:pPr>
-        <w:ind w:left="2880" w:hanging="360"/>
-      </w:pPr>
-    </w:lvl>
-    <w:lvl w:ilvl="4">
-      <w:start w:val="4"/>
-      <w:numFmt w:val="upperLetter"/>
-      <w:lvlText w:val="%5)"/>
-      <w:lvlJc w:val="left"/>
-      <w:pPr>
-        <w:ind w:left="3600" w:hanging="360"/>
-      </w:pPr>
-    </w:lvl>
-    <w:lvl w:ilvl="5">
-      <w:start w:val="4"/>
-      <w:numFmt w:val="upperLetter"/>
-      <w:lvlText w:val="%6)"/>
-      <w:lvlJc w:val="left"/>
-      <w:pPr>
-        <w:ind w:left="4320" w:hanging="360"/>
-      </w:pPr>
-    </w:lvl>
-    <w:lvl w:ilvl="6">
-      <w:start w:val="4"/>
-      <w:numFmt w:val="upperLetter"/>
-      <w:lvlText w:val="%7)"/>
-      <w:lvlJc w:val="left"/>
-      <w:pPr>
-        <w:ind w:left="5040" w:hanging="360"/>
-      </w:pPr>
-    </w:lvl>
-    <w:lvl w:ilvl="7">
-      <w:start w:val="4"/>
-      <w:numFmt w:val="upperLetter"/>
-      <w:lvlText w:val="%8)"/>
-      <w:lvlJc w:val="left"/>
-      <w:pPr>
-        <w:ind w:left="5760" w:hanging="360"/>
-      </w:pPr>
-    </w:lvl>
-    <w:lvl w:ilvl="8">
-      <w:start w:val="4"/>
-      <w:numFmt w:val="upperLetter"/>
-      <w:lvlText w:val="%9)"/>
-      <w:lvlJc w:val="left"/>
-      <w:pPr>
-        <w:ind w:left="6480" w:hanging="360"/>
-      </w:pPr>
-    </w:lvl>
-  </w:abstractNum>
-  <w:abstractNum w:abstractNumId="6" w15:restartNumberingAfterBreak="0">
-    <w:nsid w:val="00A99825"/>
-    <w:multiLevelType w:val="multilevel"/>
-    <w:tmpl w:val="7B305C70"/>
-    <w:lvl w:ilvl="0">
-      <w:start w:val="5"/>
-      <w:numFmt w:val="upperLetter"/>
-      <w:lvlText w:val="%1)"/>
-      <w:lvlJc w:val="left"/>
-      <w:pPr>
-        <w:ind w:left="720" w:hanging="360"/>
-      </w:pPr>
-    </w:lvl>
-    <w:lvl w:ilvl="1">
-      <w:start w:val="5"/>
-      <w:numFmt w:val="upperLetter"/>
-      <w:lvlText w:val="%2)"/>
-      <w:lvlJc w:val="left"/>
-      <w:pPr>
-        <w:ind w:left="1440" w:hanging="360"/>
-      </w:pPr>
-    </w:lvl>
-    <w:lvl w:ilvl="2">
-      <w:start w:val="5"/>
-      <w:numFmt w:val="upperLetter"/>
-      <w:lvlText w:val="%3)"/>
-      <w:lvlJc w:val="left"/>
-      <w:pPr>
-        <w:ind w:left="2160" w:hanging="360"/>
-      </w:pPr>
-    </w:lvl>
-    <w:lvl w:ilvl="3">
-      <w:start w:val="5"/>
-      <w:numFmt w:val="upperLetter"/>
-      <w:lvlText w:val="%4)"/>
-      <w:lvlJc w:val="left"/>
-      <w:pPr>
-        <w:ind w:left="2880" w:hanging="360"/>
-      </w:pPr>
-    </w:lvl>
-    <w:lvl w:ilvl="4">
-      <w:start w:val="5"/>
-      <w:numFmt w:val="upperLetter"/>
-      <w:lvlText w:val="%5)"/>
-      <w:lvlJc w:val="left"/>
-      <w:pPr>
-        <w:ind w:left="3600" w:hanging="360"/>
-      </w:pPr>
-    </w:lvl>
-    <w:lvl w:ilvl="5">
-      <w:start w:val="5"/>
-      <w:numFmt w:val="upperLetter"/>
-      <w:lvlText w:val="%6)"/>
-      <w:lvlJc w:val="left"/>
-      <w:pPr>
-        <w:ind w:left="4320" w:hanging="360"/>
-      </w:pPr>
-    </w:lvl>
-    <w:lvl w:ilvl="6">
-      <w:start w:val="5"/>
-      <w:numFmt w:val="upperLetter"/>
-      <w:lvlText w:val="%7)"/>
-      <w:lvlJc w:val="left"/>
-      <w:pPr>
-        <w:ind w:left="5040" w:hanging="360"/>
-      </w:pPr>
-    </w:lvl>
-    <w:lvl w:ilvl="7">
-      <w:start w:val="5"/>
-      <w:numFmt w:val="upperLetter"/>
-      <w:lvlText w:val="%8)"/>
-      <w:lvlJc w:val="left"/>
-      <w:pPr>
-        <w:ind w:left="5760" w:hanging="360"/>
-      </w:pPr>
-    </w:lvl>
-    <w:lvl w:ilvl="8">
-      <w:start w:val="5"/>
-      <w:numFmt w:val="upperLetter"/>
-      <w:lvlText w:val="%9)"/>
-      <w:lvlJc w:val="left"/>
-      <w:pPr>
-        <w:ind w:left="6480" w:hanging="360"/>
-      </w:pPr>
-    </w:lvl>
-  </w:abstractNum>
-  <w:num w:numId="1" w16cid:durableId="44724762">
+  <w:num w:numId="1" w16cid:durableId="1077090256">
     <w:abstractNumId w:val="0"/>
-  </w:num>
-  <w:num w:numId="2" w16cid:durableId="1992173993">
-    <w:abstractNumId w:val="1"/>
-    <w:lvlOverride w:ilvl="0">
-      <w:startOverride w:val="1"/>
-    </w:lvlOverride>
-    <w:lvlOverride w:ilvl="1">
-      <w:startOverride w:val="1"/>
-    </w:lvlOverride>
-    <w:lvlOverride w:ilvl="2">
-      <w:startOverride w:val="1"/>
-    </w:lvlOverride>
-    <w:lvlOverride w:ilvl="3">
-      <w:startOverride w:val="1"/>
-    </w:lvlOverride>
-    <w:lvlOverride w:ilvl="4">
-      <w:startOverride w:val="1"/>
-    </w:lvlOverride>
-    <w:lvlOverride w:ilvl="5">
-      <w:startOverride w:val="1"/>
-    </w:lvlOverride>
-    <w:lvlOverride w:ilvl="6">
-      <w:startOverride w:val="1"/>
-    </w:lvlOverride>
-    <w:lvlOverride w:ilvl="7">
-      <w:startOverride w:val="1"/>
-    </w:lvlOverride>
-    <w:lvlOverride w:ilvl="8">
-      <w:startOverride w:val="1"/>
-    </w:lvlOverride>
-  </w:num>
-  <w:num w:numId="3" w16cid:durableId="268926283">
-    <w:abstractNumId w:val="2"/>
-    <w:lvlOverride w:ilvl="0">
-      <w:startOverride w:val="1"/>
-    </w:lvlOverride>
-    <w:lvlOverride w:ilvl="1">
-      <w:startOverride w:val="1"/>
-    </w:lvlOverride>
-    <w:lvlOverride w:ilvl="2">
-      <w:startOverride w:val="1"/>
-    </w:lvlOverride>
-    <w:lvlOverride w:ilvl="3">
-      <w:startOverride w:val="1"/>
-    </w:lvlOverride>
-    <w:lvlOverride w:ilvl="4">
-      <w:startOverride w:val="1"/>
-    </w:lvlOverride>
-    <w:lvlOverride w:ilvl="5">
-      <w:startOverride w:val="1"/>
-    </w:lvlOverride>
-    <w:lvlOverride w:ilvl="6">
-      <w:startOverride w:val="1"/>
-    </w:lvlOverride>
-    <w:lvlOverride w:ilvl="7">
-      <w:startOverride w:val="1"/>
-    </w:lvlOverride>
-    <w:lvlOverride w:ilvl="8">
-      <w:startOverride w:val="1"/>
-    </w:lvlOverride>
-  </w:num>
-  <w:num w:numId="4" w16cid:durableId="1409961278">
-    <w:abstractNumId w:val="3"/>
-    <w:lvlOverride w:ilvl="0">
-      <w:startOverride w:val="2"/>
-    </w:lvlOverride>
-    <w:lvlOverride w:ilvl="1">
-      <w:startOverride w:val="2"/>
-    </w:lvlOverride>
-    <w:lvlOverride w:ilvl="2">
-      <w:startOverride w:val="2"/>
-    </w:lvlOverride>
-    <w:lvlOverride w:ilvl="3">
-      <w:startOverride w:val="2"/>
-    </w:lvlOverride>
-    <w:lvlOverride w:ilvl="4">
-      <w:startOverride w:val="2"/>
-    </w:lvlOverride>
-    <w:lvlOverride w:ilvl="5">
-      <w:startOverride w:val="2"/>
-    </w:lvlOverride>
-    <w:lvlOverride w:ilvl="6">
-      <w:startOverride w:val="2"/>
-    </w:lvlOverride>
-    <w:lvlOverride w:ilvl="7">
-      <w:startOverride w:val="2"/>
-    </w:lvlOverride>
-    <w:lvlOverride w:ilvl="8">
-      <w:startOverride w:val="2"/>
-    </w:lvlOverride>
-  </w:num>
-  <w:num w:numId="5" w16cid:durableId="1622423309">
-    <w:abstractNumId w:val="4"/>
-    <w:lvlOverride w:ilvl="0">
-      <w:startOverride w:val="3"/>
-    </w:lvlOverride>
-    <w:lvlOverride w:ilvl="1">
-      <w:startOverride w:val="3"/>
-    </w:lvlOverride>
-    <w:lvlOverride w:ilvl="2">
-      <w:startOverride w:val="3"/>
-    </w:lvlOverride>
-    <w:lvlOverride w:ilvl="3">
-      <w:startOverride w:val="3"/>
-    </w:lvlOverride>
-    <w:lvlOverride w:ilvl="4">
-      <w:startOverride w:val="3"/>
-    </w:lvlOverride>
-    <w:lvlOverride w:ilvl="5">
-      <w:startOverride w:val="3"/>
-    </w:lvlOverride>
-    <w:lvlOverride w:ilvl="6">
-      <w:startOverride w:val="3"/>
-    </w:lvlOverride>
-    <w:lvlOverride w:ilvl="7">
-      <w:startOverride w:val="3"/>
-    </w:lvlOverride>
-    <w:lvlOverride w:ilvl="8">
-      <w:startOverride w:val="3"/>
-    </w:lvlOverride>
-  </w:num>
-  <w:num w:numId="6" w16cid:durableId="2087995318">
-    <w:abstractNumId w:val="5"/>
-    <w:lvlOverride w:ilvl="0">
-      <w:startOverride w:val="4"/>
-    </w:lvlOverride>
-    <w:lvlOverride w:ilvl="1">
-      <w:startOverride w:val="4"/>
-    </w:lvlOverride>
-    <w:lvlOverride w:ilvl="2">
-      <w:startOverride w:val="4"/>
-    </w:lvlOverride>
-    <w:lvlOverride w:ilvl="3">
-      <w:startOverride w:val="4"/>
-    </w:lvlOverride>
-    <w:lvlOverride w:ilvl="4">
-      <w:startOverride w:val="4"/>
-    </w:lvlOverride>
-    <w:lvlOverride w:ilvl="5">
-      <w:startOverride w:val="4"/>
-    </w:lvlOverride>
-    <w:lvlOverride w:ilvl="6">
-      <w:startOverride w:val="4"/>
-    </w:lvlOverride>
-    <w:lvlOverride w:ilvl="7">
-      <w:startOverride w:val="4"/>
-    </w:lvlOverride>
-    <w:lvlOverride w:ilvl="8">
-      <w:startOverride w:val="4"/>
-    </w:lvlOverride>
-  </w:num>
-  <w:num w:numId="7" w16cid:durableId="545339108">
-    <w:abstractNumId w:val="6"/>
-    <w:lvlOverride w:ilvl="0">
-      <w:startOverride w:val="5"/>
-    </w:lvlOverride>
-    <w:lvlOverride w:ilvl="1">
-      <w:startOverride w:val="5"/>
-    </w:lvlOverride>
-    <w:lvlOverride w:ilvl="2">
-      <w:startOverride w:val="5"/>
-    </w:lvlOverride>
-    <w:lvlOverride w:ilvl="3">
-      <w:startOverride w:val="5"/>
-    </w:lvlOverride>
-    <w:lvlOverride w:ilvl="4">
-      <w:startOverride w:val="5"/>
-    </w:lvlOverride>
-    <w:lvlOverride w:ilvl="5">
-      <w:startOverride w:val="5"/>
-    </w:lvlOverride>
-    <w:lvlOverride w:ilvl="6">
-      <w:startOverride w:val="5"/>
-    </w:lvlOverride>
-    <w:lvlOverride w:ilvl="7">
-      <w:startOverride w:val="5"/>
-    </w:lvlOverride>
-    <w:lvlOverride w:ilvl="8">
-      <w:startOverride w:val="5"/>
-    </w:lvlOverride>
   </w:num>
 </w:numbering>
 </file>

</xml_diff>